<commit_message>
Add README, dashboard screenshot and additional query outputs
</commit_message>
<xml_diff>
--- a/Business_Insights.docx
+++ b/Business_Insights.docx
@@ -4,13 +4,36 @@
   <w:body>
     <w:p>
       <w:r>
-        <w:t>Analysis period: [25-032-26 TO 29-03-2026 ]</w:t>
-      </w:r>
-    </w:p>
-    <w:p>
-      <w:r>
-        <w:t>Data source: ecommerce_project — dbo.master_table</w:t>
-      </w:r>
+        <w:t>Analysis period: [25-032-26 TO 29-03-</w:t>
+      </w:r>
+      <w:proofErr w:type="gramStart"/>
+      <w:r>
+        <w:t>2026 ]</w:t>
+      </w:r>
+      <w:proofErr w:type="gramEnd"/>
+    </w:p>
+    <w:p>
+      <w:r>
+        <w:t xml:space="preserve">Data source: </w:t>
+      </w:r>
+      <w:proofErr w:type="spellStart"/>
+      <w:r>
+        <w:t>ecommerce_project</w:t>
+      </w:r>
+      <w:proofErr w:type="spellEnd"/>
+      <w:r>
+        <w:t xml:space="preserve"> — </w:t>
+      </w:r>
+      <w:proofErr w:type="spellStart"/>
+      <w:proofErr w:type="gramStart"/>
+      <w:r>
+        <w:t>dbo.master</w:t>
+      </w:r>
+      <w:proofErr w:type="gramEnd"/>
+      <w:r>
+        <w:t>_table</w:t>
+      </w:r>
+      <w:proofErr w:type="spellEnd"/>
     </w:p>
     <w:p>
       <w:r>
@@ -23,7 +46,14 @@
         <w:t>Ecommerce Sales Analysis — Business Insights =============================================</w:t>
       </w:r>
     </w:p>
-    <w:p/>
+    <w:p>
+      <w:pPr>
+        <w:rPr>
+          <w:b/>
+          <w:bCs/>
+        </w:rPr>
+      </w:pPr>
+    </w:p>
     <w:p>
       <w:pPr>
         <w:pStyle w:val="ListParagraph"/>
@@ -33,31 +63,59 @@
         </w:numPr>
       </w:pPr>
       <w:r>
-        <w:t>Revenue by Category</w:t>
-      </w:r>
-      <w:r>
-        <w:t xml:space="preserve"> :  </w:t>
-      </w:r>
-      <w:r>
+        <w:rPr>
+          <w:b/>
+          <w:bCs/>
+          <w:i/>
+          <w:iCs/>
+        </w:rPr>
+        <w:t xml:space="preserve">Revenue by </w:t>
+      </w:r>
+      <w:proofErr w:type="gramStart"/>
+      <w:r>
+        <w:rPr>
+          <w:b/>
+          <w:bCs/>
+          <w:i/>
+          <w:iCs/>
+        </w:rPr>
+        <w:t>Category :</w:t>
+      </w:r>
+      <w:proofErr w:type="gramEnd"/>
+    </w:p>
+    <w:p>
+      <w:pPr>
+        <w:pStyle w:val="ListParagraph"/>
+        <w:rPr>
+          <w:i/>
+          <w:iCs/>
+        </w:rPr>
+      </w:pPr>
+      <w:r>
+        <w:rPr>
+          <w:b/>
+          <w:bCs/>
+          <w:i/>
+          <w:iCs/>
+        </w:rPr>
+        <w:t xml:space="preserve">  </w:t>
+      </w:r>
+      <w:r>
+        <w:rPr>
+          <w:i/>
+          <w:iCs/>
+        </w:rPr>
         <w:t>"Bed, bath &amp; table leads all categories with ₹17.1L in revenue, followed closely by health &amp; beauty (₹16.6L) and computers &amp; accessories (₹15.9L). The top 6 categories collectively contribute over 50% of total platform revenue. Notably, security &amp; services (₹324) and fashion children's clothes (₹785) generate negligible revenue — these categories occupy platform space without meaningful business contribution and should be reviewed for continued listing."</w:t>
       </w:r>
     </w:p>
     <w:p>
       <w:pPr>
         <w:pStyle w:val="ListParagraph"/>
-        <w:numPr>
-          <w:ilvl w:val="0"/>
-          <w:numId w:val="1"/>
-        </w:numPr>
       </w:pPr>
     </w:p>
     <w:p>
       <w:pPr>
         <w:pStyle w:val="ListParagraph"/>
-        <w:numPr>
-          <w:ilvl w:val="0"/>
-          <w:numId w:val="1"/>
-        </w:numPr>
       </w:pPr>
       <w:r>
         <w:rPr>
@@ -139,7 +197,23 @@
           <w:i/>
           <w:iCs/>
         </w:rPr>
-        <w:t xml:space="preserve">"Home comfort 2 carries the most severe freight burden at 53.97% — meaning customers pay more than half the product price just in shipping. Flowers (44%), furniture mattress (37.3%), and christmas supplies (36.7%) follow. Critically, 29 out of 74 categories exceed the 20% freight burden threshold — a systemic logistics cost problem, not an </w:t>
+        <w:t xml:space="preserve">"Home comfort 2 carries the most severe freight burden at 53.97% — meaning customers pay more than half the product price just in shipping. Flowers (44%), furniture mattress (37.3%), and </w:t>
+      </w:r>
+      <w:proofErr w:type="spellStart"/>
+      <w:r>
+        <w:rPr>
+          <w:i/>
+          <w:iCs/>
+        </w:rPr>
+        <w:t>christmas</w:t>
+      </w:r>
+      <w:proofErr w:type="spellEnd"/>
+      <w:r>
+        <w:rPr>
+          <w:i/>
+          <w:iCs/>
+        </w:rPr>
+        <w:t xml:space="preserve"> supplies (36.7%) follow. Critically, 29 out of 74 categories </w:t>
       </w:r>
       <w:r>
         <w:rPr>
@@ -147,7 +221,7 @@
           <w:iCs/>
         </w:rPr>
         <w:lastRenderedPageBreak/>
-        <w:t>isolated one. Even top revenue categories are not immune: bed bath &amp; table sits at 19.74% and furniture decor at 23.67%. Electronics at 29% is particularly concerning given its high customer price sensitivity. Immediate intervention is warranted for the top 10 freight-burdened categories."</w:t>
+        <w:t>exceed the 20% freight burden threshold — a systemic logistics cost problem, not an isolated one. Even top revenue categories are not immune: bed bath &amp; table sits at 19.74% and furniture decor at 23.67%. Electronics at 29% is particularly concerning given its high customer price sensitivity. Immediate intervention is warranted for the top 10 freight-burdened categories."</w:t>
       </w:r>
     </w:p>
     <w:p>
@@ -276,6 +350,8 @@
     <w:p>
       <w:pPr>
         <w:rPr>
+          <w:b/>
+          <w:bCs/>
           <w:i/>
           <w:iCs/>
         </w:rPr>
@@ -296,7 +372,17 @@
           <w:i/>
           <w:iCs/>
         </w:rPr>
-        <w:t>Business Insight</w:t>
+        <w:t xml:space="preserve">Business </w:t>
+      </w:r>
+      <w:proofErr w:type="gramStart"/>
+      <w:r>
+        <w:rPr>
+          <w:b/>
+          <w:bCs/>
+          <w:i/>
+          <w:iCs/>
+        </w:rPr>
+        <w:t>Insight</w:t>
       </w:r>
       <w:r>
         <w:rPr>
@@ -316,6 +402,15 @@
         </w:rPr>
         <w:t>:</w:t>
       </w:r>
+      <w:proofErr w:type="gramEnd"/>
+    </w:p>
+    <w:p>
+      <w:pPr>
+        <w:rPr>
+          <w:i/>
+          <w:iCs/>
+        </w:rPr>
+      </w:pPr>
       <w:r>
         <w:rPr>
           <w:i/>
@@ -338,6 +433,7 @@
           <w:i/>
           <w:iCs/>
         </w:rPr>
+        <w:lastRenderedPageBreak/>
         <w:t>Recommendation:</w:t>
       </w:r>
       <w:r>
@@ -345,181 +441,1128 @@
           <w:i/>
           <w:iCs/>
         </w:rPr>
-        <w:t xml:space="preserve"> Focus upsell and cross-sell strategies on high AOV categories. Customers buying computers or appliances are already spending big — bundling </w:t>
-      </w:r>
-      <w:r>
-        <w:rPr>
+        <w:t xml:space="preserve"> Focus upsell and cross-sell strategies on high AOV categories. Customers buying computers or appliances are already spending big — bundling accessories or warranties here has high conversion potential compared to lower AOV categories.</w:t>
+      </w:r>
+    </w:p>
+    <w:p>
+      <w:pPr>
+        <w:rPr>
+          <w:i/>
+          <w:iCs/>
+        </w:rPr>
+      </w:pPr>
+      <w:r>
+        <w:rPr>
+          <w:b/>
+          <w:bCs/>
+          <w:i/>
+          <w:iCs/>
+        </w:rPr>
+        <w:t>8.</w:t>
+      </w:r>
+      <w:r>
+        <w:rPr>
+          <w:b/>
+          <w:bCs/>
+          <w:i/>
+          <w:iCs/>
+        </w:rPr>
+        <w:t>Business Insight:</w:t>
+      </w:r>
+      <w:r>
+        <w:rPr>
+          <w:i/>
+          <w:iCs/>
+        </w:rPr>
+        <w:t xml:space="preserve"> </w:t>
+      </w:r>
+    </w:p>
+    <w:p>
+      <w:pPr>
+        <w:rPr>
+          <w:i/>
+          <w:iCs/>
+        </w:rPr>
+      </w:pPr>
+      <w:r>
+        <w:rPr>
+          <w:i/>
+          <w:iCs/>
+        </w:rPr>
+        <w:t>São Paulo alone contributes ~15% of total store revenue, making it by far the most dominant city. There is a sharp drop to Rio de Janeiro at ~7%, and the remaining top cities contribute significantly less. This reveals extreme geographic concentration — more than 1 in 7 revenue BRL comes from a single city.</w:t>
+      </w:r>
+    </w:p>
+    <w:p>
+      <w:pPr>
+        <w:rPr>
+          <w:i/>
+          <w:iCs/>
+        </w:rPr>
+      </w:pPr>
+      <w:r>
+        <w:rPr>
+          <w:b/>
+          <w:bCs/>
+          <w:i/>
+          <w:iCs/>
+        </w:rPr>
+        <w:t>Recommendation:</w:t>
+      </w:r>
+      <w:r>
+        <w:rPr>
+          <w:i/>
+          <w:iCs/>
+        </w:rPr>
+        <w:t xml:space="preserve"> São Paulo must be treated as a priority market — logistics, delivery speed, customer service, and marketing investment should be highest here. Simultaneously, Rio de Janeiro represents the biggest growth opportunity given its size and current 7% share. A targeted expansion push in Rio could meaningfully move overall revenue numbers.</w:t>
+      </w:r>
+    </w:p>
+    <w:p>
+      <w:pPr>
+        <w:rPr>
+          <w:i/>
+          <w:iCs/>
+        </w:rPr>
+      </w:pPr>
+    </w:p>
+    <w:p>
+      <w:pPr>
+        <w:rPr>
+          <w:b/>
+          <w:bCs/>
+          <w:i/>
+          <w:iCs/>
+        </w:rPr>
+      </w:pPr>
+      <w:r>
+        <w:rPr>
+          <w:b/>
+          <w:bCs/>
+          <w:i/>
+          <w:iCs/>
+        </w:rPr>
+        <w:t>9.</w:t>
+      </w:r>
+      <w:r>
+        <w:rPr>
+          <w:b/>
+          <w:bCs/>
+          <w:i/>
+          <w:iCs/>
+        </w:rPr>
+        <w:t>Business Insight:</w:t>
+      </w:r>
+    </w:p>
+    <w:p>
+      <w:pPr>
+        <w:rPr>
+          <w:i/>
+          <w:iCs/>
+        </w:rPr>
+      </w:pPr>
+      <w:r>
+        <w:rPr>
+          <w:i/>
+          <w:iCs/>
+        </w:rPr>
+        <w:t xml:space="preserve"> Across all Brazilian states, a consistent segment of customers spends significantly above their own state's average. The top outliers spend anywhere from 4x to 10x higher than their state average — meaning high value customers exist in every region, not just São Paulo or Rio de Janeiro.</w:t>
+      </w:r>
+    </w:p>
+    <w:p>
+      <w:pPr>
+        <w:rPr>
+          <w:i/>
+          <w:iCs/>
+        </w:rPr>
+      </w:pPr>
+      <w:r>
+        <w:rPr>
+          <w:i/>
+          <w:iCs/>
+        </w:rPr>
+        <w:t xml:space="preserve">This is important because it shows the high value customer pattern is </w:t>
+      </w:r>
+      <w:r>
+        <w:rPr>
+          <w:b/>
+          <w:bCs/>
+          <w:i/>
+          <w:iCs/>
+        </w:rPr>
+        <w:t>nationwide</w:t>
+      </w:r>
+      <w:r>
+        <w:rPr>
+          <w:i/>
+          <w:iCs/>
+        </w:rPr>
+        <w:t>, not just concentrated in big cities.</w:t>
+      </w:r>
+    </w:p>
+    <w:p>
+      <w:pPr>
+        <w:rPr>
+          <w:i/>
+          <w:iCs/>
+        </w:rPr>
+      </w:pPr>
+      <w:r>
+        <w:rPr>
+          <w:b/>
+          <w:bCs/>
+          <w:i/>
+          <w:iCs/>
+        </w:rPr>
+        <w:t>Recommendation:</w:t>
+      </w:r>
+      <w:r>
+        <w:rPr>
+          <w:i/>
+          <w:iCs/>
+        </w:rPr>
+        <w:t xml:space="preserve"> These above-average spenders in each state should be identified and tagged as regional VIP customers. Since they already outspend their local peers without any targeted incentive, a personalized loyalty program — regional offers, faster delivery, early sale access — would likely increase their purchase frequency and lifetime value further.</w:t>
+      </w:r>
+    </w:p>
+    <w:p>
+      <w:pPr>
+        <w:rPr>
+          <w:b/>
+          <w:bCs/>
+          <w:i/>
+          <w:iCs/>
+        </w:rPr>
+      </w:pPr>
+    </w:p>
+    <w:p>
+      <w:pPr>
+        <w:rPr>
+          <w:b/>
+          <w:bCs/>
+          <w:i/>
+          <w:iCs/>
+        </w:rPr>
+      </w:pPr>
+      <w:r>
+        <w:rPr>
+          <w:b/>
+          <w:bCs/>
+          <w:i/>
+          <w:iCs/>
+        </w:rPr>
+        <w:t>1</w:t>
+      </w:r>
+      <w:r>
+        <w:rPr>
+          <w:b/>
+          <w:bCs/>
+          <w:i/>
+          <w:iCs/>
+        </w:rPr>
+        <w:t>0</w:t>
+      </w:r>
+      <w:r>
+        <w:rPr>
+          <w:b/>
+          <w:bCs/>
+          <w:i/>
+          <w:iCs/>
+        </w:rPr>
+        <w:t>.Top 3 customer per state</w:t>
+      </w:r>
+      <w:r>
+        <w:rPr>
+          <w:b/>
+          <w:bCs/>
+          <w:i/>
+          <w:iCs/>
+        </w:rPr>
+        <w:t xml:space="preserve">: </w:t>
+      </w:r>
+    </w:p>
+    <w:p>
+      <w:pPr>
+        <w:rPr>
+          <w:i/>
+          <w:iCs/>
+        </w:rPr>
+      </w:pPr>
+      <w:r>
+        <w:rPr>
+          <w:b/>
+          <w:bCs/>
+          <w:i/>
+          <w:iCs/>
+        </w:rPr>
+        <w:t>Insight:</w:t>
+      </w:r>
+    </w:p>
+    <w:p>
+      <w:pPr>
+        <w:ind w:left="720"/>
+        <w:rPr>
+          <w:i/>
+          <w:iCs/>
+        </w:rPr>
+      </w:pPr>
+      <w:r>
+        <w:rPr>
+          <w:i/>
+          <w:iCs/>
+        </w:rPr>
+        <w:t xml:space="preserve">Revenue is highly concentrated among a few customers in each state </w:t>
+      </w:r>
+    </w:p>
+    <w:p>
+      <w:pPr>
+        <w:ind w:left="720"/>
+        <w:rPr>
+          <w:i/>
+          <w:iCs/>
+        </w:rPr>
+      </w:pPr>
+      <w:r>
+        <w:rPr>
+          <w:i/>
+          <w:iCs/>
+        </w:rPr>
+        <w:t xml:space="preserve">Indicates </w:t>
+      </w:r>
+      <w:r>
+        <w:rPr>
+          <w:b/>
+          <w:bCs/>
+          <w:i/>
+          <w:iCs/>
+        </w:rPr>
+        <w:t>dependency on high-value users</w:t>
+      </w:r>
+      <w:r>
+        <w:rPr>
+          <w:i/>
+          <w:iCs/>
+        </w:rPr>
+        <w:t xml:space="preserve"> </w:t>
+      </w:r>
+    </w:p>
+    <w:p>
+      <w:pPr>
+        <w:rPr>
+          <w:i/>
+          <w:iCs/>
+        </w:rPr>
+      </w:pPr>
+      <w:r>
+        <w:rPr>
+          <w:b/>
+          <w:bCs/>
           <w:i/>
           <w:iCs/>
         </w:rPr>
         <w:lastRenderedPageBreak/>
-        <w:t>accessories or warranties here has high conversion potential compared to lower AOV categories.</w:t>
-      </w:r>
-    </w:p>
-    <w:p>
-      <w:pPr>
-        <w:rPr>
-          <w:i/>
-          <w:iCs/>
-        </w:rPr>
-      </w:pPr>
-      <w:r>
-        <w:rPr>
-          <w:b/>
-          <w:bCs/>
-          <w:i/>
-          <w:iCs/>
-        </w:rPr>
-        <w:t>8.</w:t>
-      </w:r>
-      <w:r>
-        <w:rPr>
-          <w:b/>
-          <w:bCs/>
-          <w:i/>
-          <w:iCs/>
-        </w:rPr>
-        <w:t>Business Insight:</w:t>
-      </w:r>
-      <w:r>
-        <w:rPr>
-          <w:i/>
-          <w:iCs/>
-        </w:rPr>
-        <w:t xml:space="preserve"> São Paulo alone contributes ~15% of total store revenue, making it by far the most dominant city. There is a sharp drop to Rio de Janeiro at ~7%, and the remaining top cities contribute significantly less. This reveals extreme geographic concentration — more than 1 in 7 revenue BRL comes from a single city.</w:t>
-      </w:r>
-    </w:p>
-    <w:p>
-      <w:pPr>
-        <w:rPr>
-          <w:i/>
-          <w:iCs/>
-        </w:rPr>
-      </w:pPr>
-      <w:r>
-        <w:rPr>
-          <w:b/>
-          <w:bCs/>
-          <w:i/>
-          <w:iCs/>
-        </w:rPr>
-        <w:t>Recommendation:</w:t>
-      </w:r>
-      <w:r>
-        <w:rPr>
-          <w:i/>
-          <w:iCs/>
-        </w:rPr>
-        <w:t xml:space="preserve"> São Paulo must be treated as a priority market — logistics, delivery speed, customer service, and marketing investment should be highest here. Simultaneously, Rio de Janeiro represents the biggest growth opportunity given its size and current 7% share. A targeted expansion push in Rio could meaningfully move overall revenue numbers.</w:t>
-      </w:r>
-    </w:p>
-    <w:p>
-      <w:pPr>
-        <w:rPr>
-          <w:i/>
-          <w:iCs/>
-        </w:rPr>
-      </w:pPr>
-    </w:p>
-    <w:p>
-      <w:pPr>
-        <w:rPr>
-          <w:i/>
-          <w:iCs/>
-        </w:rPr>
-      </w:pPr>
-      <w:r>
-        <w:rPr>
-          <w:b/>
-          <w:bCs/>
-          <w:i/>
-          <w:iCs/>
-        </w:rPr>
-        <w:t>9.</w:t>
-      </w:r>
-      <w:r>
-        <w:rPr>
-          <w:b/>
-          <w:bCs/>
-          <w:i/>
-          <w:iCs/>
-        </w:rPr>
-        <w:t>Business Insight:</w:t>
-      </w:r>
-      <w:r>
-        <w:rPr>
-          <w:i/>
-          <w:iCs/>
-        </w:rPr>
-        <w:t xml:space="preserve"> Across all Brazilian states, a consistent segment of customers spends significantly above their own state's average. The top outliers spend anywhere from 4x to 10x higher than their state average — meaning high value customers exist in every region, not just São Paulo or Rio de Janeiro.</w:t>
-      </w:r>
-    </w:p>
-    <w:p>
-      <w:pPr>
-        <w:rPr>
-          <w:i/>
-          <w:iCs/>
-        </w:rPr>
-      </w:pPr>
-      <w:r>
-        <w:rPr>
-          <w:i/>
-          <w:iCs/>
-        </w:rPr>
-        <w:t xml:space="preserve">This is important because it shows the high value customer pattern is </w:t>
-      </w:r>
-      <w:r>
-        <w:rPr>
-          <w:b/>
-          <w:bCs/>
-          <w:i/>
-          <w:iCs/>
-        </w:rPr>
-        <w:t>nationwide</w:t>
-      </w:r>
-      <w:r>
-        <w:rPr>
-          <w:i/>
-          <w:iCs/>
-        </w:rPr>
-        <w:t>, not just concentrated in big cities.</w:t>
-      </w:r>
-    </w:p>
-    <w:p>
-      <w:pPr>
-        <w:rPr>
-          <w:i/>
-          <w:iCs/>
-        </w:rPr>
-      </w:pPr>
-      <w:r>
-        <w:rPr>
-          <w:b/>
-          <w:bCs/>
-          <w:i/>
-          <w:iCs/>
-        </w:rPr>
-        <w:t>Recommendation:</w:t>
-      </w:r>
-      <w:r>
-        <w:rPr>
-          <w:i/>
-          <w:iCs/>
-        </w:rPr>
-        <w:t xml:space="preserve"> These above-average spenders in each state should be identified and tagged as regional VIP customers. Since they already outspend their local peers without any targeted incentive, a personalized loyalty program — regional offers, faster delivery, early sale access — would likely increase their purchase frequency and lifetime value further.</w:t>
-      </w:r>
-    </w:p>
-    <w:p>
-      <w:pPr>
-        <w:rPr>
-          <w:i/>
-          <w:iCs/>
-        </w:rPr>
-      </w:pPr>
-    </w:p>
-    <w:p>
-      <w:pPr>
-        <w:rPr>
+        <w:t>Business Action:</w:t>
+      </w:r>
+    </w:p>
+    <w:p>
+      <w:pPr>
+        <w:ind w:left="720"/>
+        <w:rPr>
+          <w:i/>
+          <w:iCs/>
+        </w:rPr>
+      </w:pPr>
+      <w:r>
+        <w:rPr>
+          <w:i/>
+          <w:iCs/>
+        </w:rPr>
+        <w:t xml:space="preserve">Create loyalty programs for top customers </w:t>
+      </w:r>
+    </w:p>
+    <w:p>
+      <w:pPr>
+        <w:ind w:left="720"/>
+        <w:rPr>
+          <w:i/>
+          <w:iCs/>
+        </w:rPr>
+      </w:pPr>
+      <w:r>
+        <w:rPr>
+          <w:i/>
+          <w:iCs/>
+        </w:rPr>
+        <w:t>Reduce risk by expanding mid-tier customers</w:t>
+      </w:r>
+    </w:p>
+    <w:p>
+      <w:pPr>
+        <w:rPr>
+          <w:b/>
+          <w:bCs/>
+          <w:i/>
+          <w:iCs/>
+        </w:rPr>
+      </w:pPr>
+      <w:r>
+        <w:rPr>
+          <w:b/>
+          <w:bCs/>
+          <w:i/>
+          <w:iCs/>
+        </w:rPr>
+        <w:t xml:space="preserve">11. </w:t>
+      </w:r>
+      <w:r>
+        <w:rPr>
+          <w:b/>
+          <w:bCs/>
+          <w:i/>
+          <w:iCs/>
+        </w:rPr>
+        <w:t>Monthly Growth %</w:t>
+      </w:r>
+      <w:r>
+        <w:rPr>
+          <w:b/>
+          <w:bCs/>
+          <w:i/>
+          <w:iCs/>
+        </w:rPr>
+        <w:t>:</w:t>
+      </w:r>
+    </w:p>
+    <w:p>
+      <w:pPr>
+        <w:rPr>
+          <w:i/>
+          <w:iCs/>
+        </w:rPr>
+      </w:pPr>
+      <w:r>
+        <w:rPr>
+          <w:i/>
+          <w:iCs/>
+        </w:rPr>
+        <w:t>Insight:</w:t>
+      </w:r>
+    </w:p>
+    <w:p>
+      <w:pPr>
+        <w:ind w:left="720"/>
+        <w:rPr>
+          <w:i/>
+          <w:iCs/>
+        </w:rPr>
+      </w:pPr>
+      <w:r>
+        <w:rPr>
+          <w:i/>
+          <w:iCs/>
+        </w:rPr>
+        <w:t xml:space="preserve">Revenue shows fluctuations across months </w:t>
+      </w:r>
+    </w:p>
+    <w:p>
+      <w:pPr>
+        <w:ind w:left="720"/>
+        <w:rPr>
+          <w:i/>
+          <w:iCs/>
+        </w:rPr>
+      </w:pPr>
+      <w:r>
+        <w:rPr>
+          <w:i/>
+          <w:iCs/>
+        </w:rPr>
+        <w:t xml:space="preserve">Some months show strong growth, others decline </w:t>
+      </w:r>
+    </w:p>
+    <w:p>
+      <w:pPr>
+        <w:rPr>
+          <w:i/>
+          <w:iCs/>
+        </w:rPr>
+      </w:pPr>
+      <w:r>
+        <w:rPr>
+          <w:i/>
+          <w:iCs/>
+        </w:rPr>
+        <w:t>Business Action:</w:t>
+      </w:r>
+    </w:p>
+    <w:p>
+      <w:pPr>
+        <w:ind w:left="720"/>
+        <w:rPr>
+          <w:i/>
+          <w:iCs/>
+        </w:rPr>
+      </w:pPr>
+      <w:r>
+        <w:rPr>
+          <w:i/>
+          <w:iCs/>
+        </w:rPr>
+        <w:t xml:space="preserve">Investigate reasons (seasonality / campaigns) </w:t>
+      </w:r>
+    </w:p>
+    <w:p>
+      <w:pPr>
+        <w:ind w:left="720"/>
+        <w:rPr>
+          <w:i/>
+          <w:iCs/>
+        </w:rPr>
+      </w:pPr>
+      <w:r>
+        <w:rPr>
+          <w:i/>
+          <w:iCs/>
+        </w:rPr>
+        <w:t>Plan promotions during low-growth months</w:t>
+      </w:r>
+    </w:p>
+    <w:p>
+      <w:pPr>
+        <w:rPr>
+          <w:b/>
+          <w:bCs/>
+          <w:i/>
+          <w:iCs/>
+        </w:rPr>
+      </w:pPr>
+      <w:r>
+        <w:rPr>
+          <w:b/>
+          <w:bCs/>
+          <w:i/>
+          <w:iCs/>
+        </w:rPr>
+        <w:t>12</w:t>
+      </w:r>
+      <w:r>
+        <w:rPr>
+          <w:b/>
+          <w:bCs/>
+          <w:i/>
+          <w:iCs/>
+        </w:rPr>
+        <w:t>.</w:t>
+      </w:r>
+      <w:r>
+        <w:rPr>
+          <w:b/>
+          <w:bCs/>
+          <w:i/>
+          <w:iCs/>
+        </w:rPr>
+        <w:t xml:space="preserve"> Customer Segmentation</w:t>
+      </w:r>
+    </w:p>
+    <w:p>
+      <w:pPr>
+        <w:rPr>
+          <w:i/>
+          <w:iCs/>
+        </w:rPr>
+      </w:pPr>
+      <w:r>
+        <w:rPr>
+          <w:b/>
+          <w:bCs/>
+          <w:i/>
+          <w:iCs/>
+        </w:rPr>
+        <w:t>Insight:</w:t>
+      </w:r>
+    </w:p>
+    <w:p>
+      <w:pPr>
+        <w:ind w:left="720"/>
+        <w:rPr>
+          <w:i/>
+          <w:iCs/>
+        </w:rPr>
+      </w:pPr>
+      <w:r>
+        <w:rPr>
+          <w:i/>
+          <w:iCs/>
+        </w:rPr>
+        <w:t xml:space="preserve">Customers can be divided into: </w:t>
+      </w:r>
+    </w:p>
+    <w:p>
+      <w:pPr>
+        <w:numPr>
+          <w:ilvl w:val="1"/>
+          <w:numId w:val="6"/>
+        </w:numPr>
+        <w:rPr>
+          <w:i/>
+          <w:iCs/>
+        </w:rPr>
+      </w:pPr>
+      <w:r>
+        <w:rPr>
+          <w:i/>
+          <w:iCs/>
+        </w:rPr>
+        <w:t xml:space="preserve">High-value (frequent + high spend) </w:t>
+      </w:r>
+    </w:p>
+    <w:p>
+      <w:pPr>
+        <w:numPr>
+          <w:ilvl w:val="1"/>
+          <w:numId w:val="6"/>
+        </w:numPr>
+        <w:rPr>
+          <w:i/>
+          <w:iCs/>
+        </w:rPr>
+      </w:pPr>
+      <w:r>
+        <w:rPr>
+          <w:i/>
+          <w:iCs/>
+        </w:rPr>
+        <w:t xml:space="preserve">Low-value (rare + low spend) </w:t>
+      </w:r>
+    </w:p>
+    <w:p>
+      <w:pPr>
+        <w:rPr>
+          <w:i/>
+          <w:iCs/>
+        </w:rPr>
+      </w:pPr>
+      <w:r>
+        <w:rPr>
+          <w:i/>
+          <w:iCs/>
+        </w:rPr>
+        <w:t>Business Action:</w:t>
+      </w:r>
+    </w:p>
+    <w:p>
+      <w:pPr>
+        <w:ind w:left="720"/>
+        <w:rPr>
+          <w:i/>
+          <w:iCs/>
+        </w:rPr>
+      </w:pPr>
+      <w:r>
+        <w:rPr>
+          <w:i/>
+          <w:iCs/>
+        </w:rPr>
+        <w:t xml:space="preserve">Target high-value → retention </w:t>
+      </w:r>
+    </w:p>
+    <w:p>
+      <w:pPr>
+        <w:ind w:left="720"/>
+        <w:rPr>
+          <w:i/>
+          <w:iCs/>
+        </w:rPr>
+      </w:pPr>
+      <w:r>
+        <w:rPr>
+          <w:i/>
+          <w:iCs/>
+        </w:rPr>
+        <w:t>Target low-value → activation campaigns</w:t>
+      </w:r>
+    </w:p>
+    <w:p>
+      <w:pPr>
+        <w:rPr>
+          <w:i/>
+          <w:iCs/>
+        </w:rPr>
+      </w:pPr>
+    </w:p>
+    <w:p>
+      <w:pPr>
+        <w:rPr>
+          <w:b/>
+          <w:bCs/>
+          <w:i/>
+          <w:iCs/>
+        </w:rPr>
+      </w:pPr>
+      <w:r>
+        <w:rPr>
+          <w:b/>
+          <w:bCs/>
+          <w:i/>
+          <w:iCs/>
+        </w:rPr>
+        <w:t>13</w:t>
+      </w:r>
+      <w:r>
+        <w:rPr>
+          <w:b/>
+          <w:bCs/>
+          <w:i/>
+          <w:iCs/>
+        </w:rPr>
+        <w:t xml:space="preserve">. </w:t>
+      </w:r>
+      <w:proofErr w:type="gramStart"/>
+      <w:r>
+        <w:rPr>
+          <w:b/>
+          <w:bCs/>
+          <w:i/>
+          <w:iCs/>
+        </w:rPr>
+        <w:t xml:space="preserve">Customer </w:t>
+      </w:r>
+      <w:r>
+        <w:rPr>
+          <w:b/>
+          <w:bCs/>
+          <w:i/>
+          <w:iCs/>
+        </w:rPr>
+        <w:t xml:space="preserve"> Retention</w:t>
+      </w:r>
+      <w:proofErr w:type="gramEnd"/>
+      <w:r>
+        <w:rPr>
+          <w:b/>
+          <w:bCs/>
+          <w:i/>
+          <w:iCs/>
+        </w:rPr>
+        <w:t xml:space="preserve"> :</w:t>
+      </w:r>
+    </w:p>
+    <w:p>
+      <w:pPr>
+        <w:rPr>
+          <w:i/>
+          <w:iCs/>
+        </w:rPr>
+      </w:pPr>
+      <w:r>
+        <w:rPr>
+          <w:i/>
+          <w:iCs/>
+        </w:rPr>
+        <w:t>Insight:</w:t>
+      </w:r>
+    </w:p>
+    <w:p>
+      <w:pPr>
+        <w:ind w:left="720"/>
+        <w:rPr>
+          <w:i/>
+          <w:iCs/>
+        </w:rPr>
+      </w:pPr>
+      <w:r>
+        <w:rPr>
+          <w:i/>
+          <w:iCs/>
+        </w:rPr>
+        <w:t xml:space="preserve">Majority customers are one-time buyers </w:t>
+      </w:r>
+    </w:p>
+    <w:p>
+      <w:pPr>
+        <w:ind w:left="720"/>
+        <w:rPr>
+          <w:i/>
+          <w:iCs/>
+        </w:rPr>
+      </w:pPr>
+      <w:r>
+        <w:rPr>
+          <w:i/>
+          <w:iCs/>
+        </w:rPr>
+        <w:t xml:space="preserve">Low repeat rate = retention issue </w:t>
+      </w:r>
+    </w:p>
+    <w:p>
+      <w:pPr>
+        <w:rPr>
+          <w:i/>
+          <w:iCs/>
+        </w:rPr>
+      </w:pPr>
+      <w:r>
+        <w:rPr>
+          <w:i/>
+          <w:iCs/>
+        </w:rPr>
+        <w:t>Business Action:</w:t>
+      </w:r>
+    </w:p>
+    <w:p>
+      <w:pPr>
+        <w:ind w:left="720"/>
+        <w:rPr>
+          <w:i/>
+          <w:iCs/>
+        </w:rPr>
+      </w:pPr>
+      <w:r>
+        <w:rPr>
+          <w:i/>
+          <w:iCs/>
+        </w:rPr>
+        <w:t xml:space="preserve">Improve post-purchase engagement </w:t>
+      </w:r>
+    </w:p>
+    <w:p>
+      <w:pPr>
+        <w:ind w:left="720"/>
+        <w:rPr>
+          <w:i/>
+          <w:iCs/>
+        </w:rPr>
+      </w:pPr>
+      <w:r>
+        <w:rPr>
+          <w:i/>
+          <w:iCs/>
+        </w:rPr>
+        <w:t>Introduce discounts for repeat orders</w:t>
+      </w:r>
+    </w:p>
+    <w:p>
+      <w:pPr>
+        <w:ind w:left="720"/>
+        <w:rPr>
+          <w:b/>
+          <w:bCs/>
+          <w:i/>
+          <w:iCs/>
+        </w:rPr>
+      </w:pPr>
+      <w:r>
+        <w:rPr>
+          <w:b/>
+          <w:bCs/>
+          <w:i/>
+          <w:iCs/>
+        </w:rPr>
+        <w:lastRenderedPageBreak/>
+        <w:t>14</w:t>
+      </w:r>
+      <w:r>
+        <w:rPr>
+          <w:b/>
+          <w:bCs/>
+          <w:i/>
+          <w:iCs/>
+        </w:rPr>
+        <w:t>.</w:t>
+      </w:r>
+      <w:r>
+        <w:rPr>
+          <w:b/>
+          <w:bCs/>
+          <w:i/>
+          <w:iCs/>
+        </w:rPr>
+        <w:t xml:space="preserve"> Revenue </w:t>
+      </w:r>
+      <w:proofErr w:type="gramStart"/>
+      <w:r>
+        <w:rPr>
+          <w:b/>
+          <w:bCs/>
+          <w:i/>
+          <w:iCs/>
+        </w:rPr>
+        <w:t>Growth</w:t>
+      </w:r>
+      <w:r>
+        <w:rPr>
+          <w:b/>
+          <w:bCs/>
+          <w:i/>
+          <w:iCs/>
+        </w:rPr>
+        <w:t xml:space="preserve"> :</w:t>
+      </w:r>
+      <w:proofErr w:type="gramEnd"/>
+    </w:p>
+    <w:p>
+      <w:pPr>
+        <w:ind w:left="720"/>
+        <w:rPr>
+          <w:i/>
+          <w:iCs/>
+        </w:rPr>
+      </w:pPr>
+      <w:r>
+        <w:rPr>
+          <w:i/>
+          <w:iCs/>
+        </w:rPr>
+        <w:t>Insight:</w:t>
+      </w:r>
+    </w:p>
+    <w:p>
+      <w:pPr>
+        <w:ind w:left="720"/>
+        <w:rPr>
+          <w:i/>
+          <w:iCs/>
+        </w:rPr>
+      </w:pPr>
+      <w:r>
+        <w:rPr>
+          <w:i/>
+          <w:iCs/>
+        </w:rPr>
+        <w:t xml:space="preserve">Business shows overall growth trend but inconsistent </w:t>
+      </w:r>
+    </w:p>
+    <w:p>
+      <w:pPr>
+        <w:ind w:left="720"/>
+        <w:rPr>
+          <w:i/>
+          <w:iCs/>
+        </w:rPr>
+      </w:pPr>
+      <w:r>
+        <w:rPr>
+          <w:i/>
+          <w:iCs/>
+        </w:rPr>
+        <w:t xml:space="preserve">Sudden spikes indicate external factors (sales/events) </w:t>
+      </w:r>
+    </w:p>
+    <w:p>
+      <w:pPr>
+        <w:ind w:left="720"/>
+        <w:rPr>
+          <w:i/>
+          <w:iCs/>
+        </w:rPr>
+      </w:pPr>
+      <w:r>
+        <w:rPr>
+          <w:i/>
+          <w:iCs/>
+        </w:rPr>
+        <w:t>Business Action:</w:t>
+      </w:r>
+    </w:p>
+    <w:p>
+      <w:pPr>
+        <w:ind w:left="720"/>
+        <w:rPr>
+          <w:i/>
+          <w:iCs/>
+        </w:rPr>
+      </w:pPr>
+      <w:r>
+        <w:rPr>
+          <w:i/>
+          <w:iCs/>
+        </w:rPr>
+        <w:t xml:space="preserve">Replicate high-performing months </w:t>
+      </w:r>
+    </w:p>
+    <w:p>
+      <w:pPr>
+        <w:ind w:left="720"/>
+        <w:rPr>
+          <w:i/>
+          <w:iCs/>
+        </w:rPr>
+      </w:pPr>
+      <w:r>
+        <w:rPr>
+          <w:i/>
+          <w:iCs/>
+        </w:rPr>
+        <w:t xml:space="preserve">Identify drivers of spikes </w:t>
+      </w:r>
+    </w:p>
+    <w:p>
+      <w:pPr>
+        <w:ind w:left="720"/>
+        <w:rPr>
+          <w:b/>
+          <w:bCs/>
+          <w:i/>
+          <w:iCs/>
+        </w:rPr>
+      </w:pPr>
+      <w:r>
+        <w:rPr>
+          <w:b/>
+          <w:bCs/>
+          <w:i/>
+          <w:iCs/>
+        </w:rPr>
+        <w:t>15</w:t>
+      </w:r>
+      <w:r>
+        <w:rPr>
+          <w:b/>
+          <w:bCs/>
+          <w:i/>
+          <w:iCs/>
+        </w:rPr>
+        <w:t>.</w:t>
+      </w:r>
+      <w:r>
+        <w:rPr>
+          <w:b/>
+          <w:bCs/>
+          <w:i/>
+          <w:iCs/>
+        </w:rPr>
+        <w:t xml:space="preserve"> Delivery </w:t>
+      </w:r>
+      <w:proofErr w:type="gramStart"/>
+      <w:r>
+        <w:rPr>
+          <w:b/>
+          <w:bCs/>
+          <w:i/>
+          <w:iCs/>
+        </w:rPr>
+        <w:t>Performance</w:t>
+      </w:r>
+      <w:r>
+        <w:rPr>
+          <w:b/>
+          <w:bCs/>
+          <w:i/>
+          <w:iCs/>
+        </w:rPr>
+        <w:t xml:space="preserve"> :</w:t>
+      </w:r>
+      <w:proofErr w:type="gramEnd"/>
+    </w:p>
+    <w:p>
+      <w:pPr>
+        <w:ind w:left="720"/>
+        <w:rPr>
+          <w:i/>
+          <w:iCs/>
+        </w:rPr>
+      </w:pPr>
+      <w:r>
+        <w:rPr>
+          <w:i/>
+          <w:iCs/>
+        </w:rPr>
+        <w:t>Insight:</w:t>
+      </w:r>
+    </w:p>
+    <w:p>
+      <w:pPr>
+        <w:ind w:left="720"/>
+        <w:rPr>
+          <w:i/>
+          <w:iCs/>
+        </w:rPr>
+      </w:pPr>
+      <w:r>
+        <w:rPr>
+          <w:i/>
+          <w:iCs/>
+        </w:rPr>
+        <w:t xml:space="preserve">% of delayed deliveries affects customer experience </w:t>
+      </w:r>
+    </w:p>
+    <w:p>
+      <w:pPr>
+        <w:ind w:left="720"/>
+        <w:rPr>
+          <w:i/>
+          <w:iCs/>
+        </w:rPr>
+      </w:pPr>
+      <w:r>
+        <w:rPr>
+          <w:i/>
+          <w:iCs/>
+        </w:rPr>
+        <w:t xml:space="preserve">Late deliveries may lead to churn </w:t>
+      </w:r>
+    </w:p>
+    <w:p>
+      <w:pPr>
+        <w:ind w:left="720"/>
+        <w:rPr>
+          <w:i/>
+          <w:iCs/>
+        </w:rPr>
+      </w:pPr>
+      <w:r>
+        <w:rPr>
+          <w:i/>
+          <w:iCs/>
+        </w:rPr>
+        <w:t>Business Action:</w:t>
+      </w:r>
+    </w:p>
+    <w:p>
+      <w:pPr>
+        <w:ind w:left="720"/>
+        <w:rPr>
+          <w:i/>
+          <w:iCs/>
+        </w:rPr>
+      </w:pPr>
+      <w:r>
+        <w:rPr>
+          <w:i/>
+          <w:iCs/>
+        </w:rPr>
+        <w:t xml:space="preserve">Optimize logistics </w:t>
+      </w:r>
+    </w:p>
+    <w:p>
+      <w:pPr>
+        <w:ind w:left="720"/>
+        <w:rPr>
+          <w:i/>
+          <w:iCs/>
+        </w:rPr>
+      </w:pPr>
+      <w:r>
+        <w:rPr>
+          <w:i/>
+          <w:iCs/>
+        </w:rPr>
+        <w:t xml:space="preserve">Improve delivery partner efficiency </w:t>
+      </w:r>
+    </w:p>
+    <w:p>
+      <w:pPr>
+        <w:ind w:left="720"/>
+        <w:rPr>
+          <w:b/>
+          <w:bCs/>
+          <w:i/>
+          <w:iCs/>
+        </w:rPr>
+      </w:pPr>
+    </w:p>
+    <w:p>
+      <w:pPr>
+        <w:rPr>
+          <w:b/>
+          <w:bCs/>
           <w:i/>
           <w:iCs/>
         </w:rPr>
@@ -547,6 +1590,1198 @@
 <file path=word/numbering.xml><?xml version="1.0" encoding="utf-8"?>
 <w:numbering xmlns:wpc="http://schemas.microsoft.com/office/word/2010/wordprocessingCanvas" xmlns:cx="http://schemas.microsoft.com/office/drawing/2014/chartex" xmlns:cx1="http://schemas.microsoft.com/office/drawing/2015/9/8/chartex" xmlns:cx2="http://schemas.microsoft.com/office/drawing/2015/10/21/chartex" xmlns:cx3="http://schemas.microsoft.com/office/drawing/2016/5/9/chartex" xmlns:cx4="http://schemas.microsoft.com/office/drawing/2016/5/10/chartex" xmlns:cx5="http://schemas.microsoft.com/office/drawing/2016/5/11/chartex" xmlns:cx6="http://schemas.microsoft.com/office/drawing/2016/5/12/chartex" xmlns:cx7="http://schemas.microsoft.com/office/drawing/2016/5/13/chartex" xmlns:cx8="http://schemas.microsoft.com/office/drawing/2016/5/14/chartex" xmlns:mc="http://schemas.openxmlformats.org/markup-compatibility/2006" xmlns:aink="http://schemas.microsoft.com/office/drawing/2016/ink" xmlns:am3d="http://schemas.microsoft.com/office/drawing/2017/model3d" xmlns:o="urn:schemas-microsoft-com:office:office" xmlns:oel="http://schemas.microsoft.com/office/2019/extlst" xmlns:r="http://schemas.openxmlformats.org/officeDocument/2006/relationships" xmlns:m="http://schemas.openxmlformats.org/officeDocument/2006/math" xmlns:v="urn:schemas-microsoft-com:vml" xmlns:wp14="http://schemas.microsoft.com/office/word/2010/wordprocessingDrawing" xmlns:wp="http://schemas.openxmlformats.org/drawingml/2006/wordprocessingDrawing" xmlns:w10="urn:schemas-microsoft-com:office:word" xmlns:w="http://schemas.openxmlformats.org/wordprocessingml/2006/main" xmlns:w14="http://schemas.microsoft.com/office/word/2010/wordml" xmlns:w15="http://schemas.microsoft.com/office/word/2012/wordml" xmlns:w16cex="http://schemas.microsoft.com/office/word/2018/wordml/cex" xmlns:w16cid="http://schemas.microsoft.com/office/word/2016/wordml/cid" xmlns:w16="http://schemas.microsoft.com/office/word/2018/wordml" xmlns:w16sdtdh="http://schemas.microsoft.com/office/word/2020/wordml/sdtdatahash" xmlns:w16se="http://schemas.microsoft.com/office/word/2015/wordml/symex" xmlns:wpg="http://schemas.microsoft.com/office/word/2010/wordprocessingGroup" xmlns:wpi="http://schemas.microsoft.com/office/word/2010/wordprocessingInk" xmlns:wne="http://schemas.microsoft.com/office/word/2006/wordml" xmlns:wps="http://schemas.microsoft.com/office/word/2010/wordprocessingShape" mc:Ignorable="w14 w15 w16se w16cid w16 w16cex w16sdtdh wp14">
   <w:abstractNum w:abstractNumId="0" w15:restartNumberingAfterBreak="0">
+    <w:nsid w:val="0F015460"/>
+    <w:multiLevelType w:val="multilevel"/>
+    <w:tmpl w:val="5DFACB96"/>
+    <w:lvl w:ilvl="0">
+      <w:start w:val="1"/>
+      <w:numFmt w:val="bullet"/>
+      <w:lvlText w:val=""/>
+      <w:lvlJc w:val="left"/>
+      <w:pPr>
+        <w:tabs>
+          <w:tab w:val="num" w:pos="720"/>
+        </w:tabs>
+        <w:ind w:left="720" w:hanging="360"/>
+      </w:pPr>
+      <w:rPr>
+        <w:rFonts w:ascii="Symbol" w:hAnsi="Symbol" w:hint="default"/>
+        <w:sz w:val="20"/>
+      </w:rPr>
+    </w:lvl>
+    <w:lvl w:ilvl="1" w:tentative="1">
+      <w:start w:val="1"/>
+      <w:numFmt w:val="bullet"/>
+      <w:lvlText w:val="o"/>
+      <w:lvlJc w:val="left"/>
+      <w:pPr>
+        <w:tabs>
+          <w:tab w:val="num" w:pos="1440"/>
+        </w:tabs>
+        <w:ind w:left="1440" w:hanging="360"/>
+      </w:pPr>
+      <w:rPr>
+        <w:rFonts w:ascii="Courier New" w:hAnsi="Courier New" w:hint="default"/>
+        <w:sz w:val="20"/>
+      </w:rPr>
+    </w:lvl>
+    <w:lvl w:ilvl="2" w:tentative="1">
+      <w:start w:val="1"/>
+      <w:numFmt w:val="bullet"/>
+      <w:lvlText w:val=""/>
+      <w:lvlJc w:val="left"/>
+      <w:pPr>
+        <w:tabs>
+          <w:tab w:val="num" w:pos="2160"/>
+        </w:tabs>
+        <w:ind w:left="2160" w:hanging="360"/>
+      </w:pPr>
+      <w:rPr>
+        <w:rFonts w:ascii="Wingdings" w:hAnsi="Wingdings" w:hint="default"/>
+        <w:sz w:val="20"/>
+      </w:rPr>
+    </w:lvl>
+    <w:lvl w:ilvl="3" w:tentative="1">
+      <w:start w:val="1"/>
+      <w:numFmt w:val="bullet"/>
+      <w:lvlText w:val=""/>
+      <w:lvlJc w:val="left"/>
+      <w:pPr>
+        <w:tabs>
+          <w:tab w:val="num" w:pos="2880"/>
+        </w:tabs>
+        <w:ind w:left="2880" w:hanging="360"/>
+      </w:pPr>
+      <w:rPr>
+        <w:rFonts w:ascii="Wingdings" w:hAnsi="Wingdings" w:hint="default"/>
+        <w:sz w:val="20"/>
+      </w:rPr>
+    </w:lvl>
+    <w:lvl w:ilvl="4" w:tentative="1">
+      <w:start w:val="1"/>
+      <w:numFmt w:val="bullet"/>
+      <w:lvlText w:val=""/>
+      <w:lvlJc w:val="left"/>
+      <w:pPr>
+        <w:tabs>
+          <w:tab w:val="num" w:pos="3600"/>
+        </w:tabs>
+        <w:ind w:left="3600" w:hanging="360"/>
+      </w:pPr>
+      <w:rPr>
+        <w:rFonts w:ascii="Wingdings" w:hAnsi="Wingdings" w:hint="default"/>
+        <w:sz w:val="20"/>
+      </w:rPr>
+    </w:lvl>
+    <w:lvl w:ilvl="5" w:tentative="1">
+      <w:start w:val="1"/>
+      <w:numFmt w:val="bullet"/>
+      <w:lvlText w:val=""/>
+      <w:lvlJc w:val="left"/>
+      <w:pPr>
+        <w:tabs>
+          <w:tab w:val="num" w:pos="4320"/>
+        </w:tabs>
+        <w:ind w:left="4320" w:hanging="360"/>
+      </w:pPr>
+      <w:rPr>
+        <w:rFonts w:ascii="Wingdings" w:hAnsi="Wingdings" w:hint="default"/>
+        <w:sz w:val="20"/>
+      </w:rPr>
+    </w:lvl>
+    <w:lvl w:ilvl="6" w:tentative="1">
+      <w:start w:val="1"/>
+      <w:numFmt w:val="bullet"/>
+      <w:lvlText w:val=""/>
+      <w:lvlJc w:val="left"/>
+      <w:pPr>
+        <w:tabs>
+          <w:tab w:val="num" w:pos="5040"/>
+        </w:tabs>
+        <w:ind w:left="5040" w:hanging="360"/>
+      </w:pPr>
+      <w:rPr>
+        <w:rFonts w:ascii="Wingdings" w:hAnsi="Wingdings" w:hint="default"/>
+        <w:sz w:val="20"/>
+      </w:rPr>
+    </w:lvl>
+    <w:lvl w:ilvl="7" w:tentative="1">
+      <w:start w:val="1"/>
+      <w:numFmt w:val="bullet"/>
+      <w:lvlText w:val=""/>
+      <w:lvlJc w:val="left"/>
+      <w:pPr>
+        <w:tabs>
+          <w:tab w:val="num" w:pos="5760"/>
+        </w:tabs>
+        <w:ind w:left="5760" w:hanging="360"/>
+      </w:pPr>
+      <w:rPr>
+        <w:rFonts w:ascii="Wingdings" w:hAnsi="Wingdings" w:hint="default"/>
+        <w:sz w:val="20"/>
+      </w:rPr>
+    </w:lvl>
+    <w:lvl w:ilvl="8" w:tentative="1">
+      <w:start w:val="1"/>
+      <w:numFmt w:val="bullet"/>
+      <w:lvlText w:val=""/>
+      <w:lvlJc w:val="left"/>
+      <w:pPr>
+        <w:tabs>
+          <w:tab w:val="num" w:pos="6480"/>
+        </w:tabs>
+        <w:ind w:left="6480" w:hanging="360"/>
+      </w:pPr>
+      <w:rPr>
+        <w:rFonts w:ascii="Wingdings" w:hAnsi="Wingdings" w:hint="default"/>
+        <w:sz w:val="20"/>
+      </w:rPr>
+    </w:lvl>
+  </w:abstractNum>
+  <w:abstractNum w:abstractNumId="1" w15:restartNumberingAfterBreak="0">
+    <w:nsid w:val="0F847802"/>
+    <w:multiLevelType w:val="multilevel"/>
+    <w:tmpl w:val="7E60B308"/>
+    <w:lvl w:ilvl="0">
+      <w:start w:val="1"/>
+      <w:numFmt w:val="bullet"/>
+      <w:lvlText w:val=""/>
+      <w:lvlJc w:val="left"/>
+      <w:pPr>
+        <w:tabs>
+          <w:tab w:val="num" w:pos="720"/>
+        </w:tabs>
+        <w:ind w:left="720" w:hanging="360"/>
+      </w:pPr>
+      <w:rPr>
+        <w:rFonts w:ascii="Symbol" w:hAnsi="Symbol" w:hint="default"/>
+        <w:sz w:val="20"/>
+      </w:rPr>
+    </w:lvl>
+    <w:lvl w:ilvl="1" w:tentative="1">
+      <w:start w:val="1"/>
+      <w:numFmt w:val="bullet"/>
+      <w:lvlText w:val="o"/>
+      <w:lvlJc w:val="left"/>
+      <w:pPr>
+        <w:tabs>
+          <w:tab w:val="num" w:pos="1440"/>
+        </w:tabs>
+        <w:ind w:left="1440" w:hanging="360"/>
+      </w:pPr>
+      <w:rPr>
+        <w:rFonts w:ascii="Courier New" w:hAnsi="Courier New" w:hint="default"/>
+        <w:sz w:val="20"/>
+      </w:rPr>
+    </w:lvl>
+    <w:lvl w:ilvl="2" w:tentative="1">
+      <w:start w:val="1"/>
+      <w:numFmt w:val="bullet"/>
+      <w:lvlText w:val=""/>
+      <w:lvlJc w:val="left"/>
+      <w:pPr>
+        <w:tabs>
+          <w:tab w:val="num" w:pos="2160"/>
+        </w:tabs>
+        <w:ind w:left="2160" w:hanging="360"/>
+      </w:pPr>
+      <w:rPr>
+        <w:rFonts w:ascii="Wingdings" w:hAnsi="Wingdings" w:hint="default"/>
+        <w:sz w:val="20"/>
+      </w:rPr>
+    </w:lvl>
+    <w:lvl w:ilvl="3" w:tentative="1">
+      <w:start w:val="1"/>
+      <w:numFmt w:val="bullet"/>
+      <w:lvlText w:val=""/>
+      <w:lvlJc w:val="left"/>
+      <w:pPr>
+        <w:tabs>
+          <w:tab w:val="num" w:pos="2880"/>
+        </w:tabs>
+        <w:ind w:left="2880" w:hanging="360"/>
+      </w:pPr>
+      <w:rPr>
+        <w:rFonts w:ascii="Wingdings" w:hAnsi="Wingdings" w:hint="default"/>
+        <w:sz w:val="20"/>
+      </w:rPr>
+    </w:lvl>
+    <w:lvl w:ilvl="4" w:tentative="1">
+      <w:start w:val="1"/>
+      <w:numFmt w:val="bullet"/>
+      <w:lvlText w:val=""/>
+      <w:lvlJc w:val="left"/>
+      <w:pPr>
+        <w:tabs>
+          <w:tab w:val="num" w:pos="3600"/>
+        </w:tabs>
+        <w:ind w:left="3600" w:hanging="360"/>
+      </w:pPr>
+      <w:rPr>
+        <w:rFonts w:ascii="Wingdings" w:hAnsi="Wingdings" w:hint="default"/>
+        <w:sz w:val="20"/>
+      </w:rPr>
+    </w:lvl>
+    <w:lvl w:ilvl="5" w:tentative="1">
+      <w:start w:val="1"/>
+      <w:numFmt w:val="bullet"/>
+      <w:lvlText w:val=""/>
+      <w:lvlJc w:val="left"/>
+      <w:pPr>
+        <w:tabs>
+          <w:tab w:val="num" w:pos="4320"/>
+        </w:tabs>
+        <w:ind w:left="4320" w:hanging="360"/>
+      </w:pPr>
+      <w:rPr>
+        <w:rFonts w:ascii="Wingdings" w:hAnsi="Wingdings" w:hint="default"/>
+        <w:sz w:val="20"/>
+      </w:rPr>
+    </w:lvl>
+    <w:lvl w:ilvl="6" w:tentative="1">
+      <w:start w:val="1"/>
+      <w:numFmt w:val="bullet"/>
+      <w:lvlText w:val=""/>
+      <w:lvlJc w:val="left"/>
+      <w:pPr>
+        <w:tabs>
+          <w:tab w:val="num" w:pos="5040"/>
+        </w:tabs>
+        <w:ind w:left="5040" w:hanging="360"/>
+      </w:pPr>
+      <w:rPr>
+        <w:rFonts w:ascii="Wingdings" w:hAnsi="Wingdings" w:hint="default"/>
+        <w:sz w:val="20"/>
+      </w:rPr>
+    </w:lvl>
+    <w:lvl w:ilvl="7" w:tentative="1">
+      <w:start w:val="1"/>
+      <w:numFmt w:val="bullet"/>
+      <w:lvlText w:val=""/>
+      <w:lvlJc w:val="left"/>
+      <w:pPr>
+        <w:tabs>
+          <w:tab w:val="num" w:pos="5760"/>
+        </w:tabs>
+        <w:ind w:left="5760" w:hanging="360"/>
+      </w:pPr>
+      <w:rPr>
+        <w:rFonts w:ascii="Wingdings" w:hAnsi="Wingdings" w:hint="default"/>
+        <w:sz w:val="20"/>
+      </w:rPr>
+    </w:lvl>
+    <w:lvl w:ilvl="8" w:tentative="1">
+      <w:start w:val="1"/>
+      <w:numFmt w:val="bullet"/>
+      <w:lvlText w:val=""/>
+      <w:lvlJc w:val="left"/>
+      <w:pPr>
+        <w:tabs>
+          <w:tab w:val="num" w:pos="6480"/>
+        </w:tabs>
+        <w:ind w:left="6480" w:hanging="360"/>
+      </w:pPr>
+      <w:rPr>
+        <w:rFonts w:ascii="Wingdings" w:hAnsi="Wingdings" w:hint="default"/>
+        <w:sz w:val="20"/>
+      </w:rPr>
+    </w:lvl>
+  </w:abstractNum>
+  <w:abstractNum w:abstractNumId="2" w15:restartNumberingAfterBreak="0">
+    <w:nsid w:val="16015A76"/>
+    <w:multiLevelType w:val="multilevel"/>
+    <w:tmpl w:val="7728B90E"/>
+    <w:lvl w:ilvl="0">
+      <w:start w:val="1"/>
+      <w:numFmt w:val="bullet"/>
+      <w:lvlText w:val=""/>
+      <w:lvlJc w:val="left"/>
+      <w:pPr>
+        <w:tabs>
+          <w:tab w:val="num" w:pos="720"/>
+        </w:tabs>
+        <w:ind w:left="720" w:hanging="360"/>
+      </w:pPr>
+      <w:rPr>
+        <w:rFonts w:ascii="Symbol" w:hAnsi="Symbol" w:hint="default"/>
+        <w:sz w:val="20"/>
+      </w:rPr>
+    </w:lvl>
+    <w:lvl w:ilvl="1" w:tentative="1">
+      <w:start w:val="1"/>
+      <w:numFmt w:val="bullet"/>
+      <w:lvlText w:val="o"/>
+      <w:lvlJc w:val="left"/>
+      <w:pPr>
+        <w:tabs>
+          <w:tab w:val="num" w:pos="1440"/>
+        </w:tabs>
+        <w:ind w:left="1440" w:hanging="360"/>
+      </w:pPr>
+      <w:rPr>
+        <w:rFonts w:ascii="Courier New" w:hAnsi="Courier New" w:hint="default"/>
+        <w:sz w:val="20"/>
+      </w:rPr>
+    </w:lvl>
+    <w:lvl w:ilvl="2" w:tentative="1">
+      <w:start w:val="1"/>
+      <w:numFmt w:val="bullet"/>
+      <w:lvlText w:val=""/>
+      <w:lvlJc w:val="left"/>
+      <w:pPr>
+        <w:tabs>
+          <w:tab w:val="num" w:pos="2160"/>
+        </w:tabs>
+        <w:ind w:left="2160" w:hanging="360"/>
+      </w:pPr>
+      <w:rPr>
+        <w:rFonts w:ascii="Wingdings" w:hAnsi="Wingdings" w:hint="default"/>
+        <w:sz w:val="20"/>
+      </w:rPr>
+    </w:lvl>
+    <w:lvl w:ilvl="3" w:tentative="1">
+      <w:start w:val="1"/>
+      <w:numFmt w:val="bullet"/>
+      <w:lvlText w:val=""/>
+      <w:lvlJc w:val="left"/>
+      <w:pPr>
+        <w:tabs>
+          <w:tab w:val="num" w:pos="2880"/>
+        </w:tabs>
+        <w:ind w:left="2880" w:hanging="360"/>
+      </w:pPr>
+      <w:rPr>
+        <w:rFonts w:ascii="Wingdings" w:hAnsi="Wingdings" w:hint="default"/>
+        <w:sz w:val="20"/>
+      </w:rPr>
+    </w:lvl>
+    <w:lvl w:ilvl="4" w:tentative="1">
+      <w:start w:val="1"/>
+      <w:numFmt w:val="bullet"/>
+      <w:lvlText w:val=""/>
+      <w:lvlJc w:val="left"/>
+      <w:pPr>
+        <w:tabs>
+          <w:tab w:val="num" w:pos="3600"/>
+        </w:tabs>
+        <w:ind w:left="3600" w:hanging="360"/>
+      </w:pPr>
+      <w:rPr>
+        <w:rFonts w:ascii="Wingdings" w:hAnsi="Wingdings" w:hint="default"/>
+        <w:sz w:val="20"/>
+      </w:rPr>
+    </w:lvl>
+    <w:lvl w:ilvl="5" w:tentative="1">
+      <w:start w:val="1"/>
+      <w:numFmt w:val="bullet"/>
+      <w:lvlText w:val=""/>
+      <w:lvlJc w:val="left"/>
+      <w:pPr>
+        <w:tabs>
+          <w:tab w:val="num" w:pos="4320"/>
+        </w:tabs>
+        <w:ind w:left="4320" w:hanging="360"/>
+      </w:pPr>
+      <w:rPr>
+        <w:rFonts w:ascii="Wingdings" w:hAnsi="Wingdings" w:hint="default"/>
+        <w:sz w:val="20"/>
+      </w:rPr>
+    </w:lvl>
+    <w:lvl w:ilvl="6" w:tentative="1">
+      <w:start w:val="1"/>
+      <w:numFmt w:val="bullet"/>
+      <w:lvlText w:val=""/>
+      <w:lvlJc w:val="left"/>
+      <w:pPr>
+        <w:tabs>
+          <w:tab w:val="num" w:pos="5040"/>
+        </w:tabs>
+        <w:ind w:left="5040" w:hanging="360"/>
+      </w:pPr>
+      <w:rPr>
+        <w:rFonts w:ascii="Wingdings" w:hAnsi="Wingdings" w:hint="default"/>
+        <w:sz w:val="20"/>
+      </w:rPr>
+    </w:lvl>
+    <w:lvl w:ilvl="7" w:tentative="1">
+      <w:start w:val="1"/>
+      <w:numFmt w:val="bullet"/>
+      <w:lvlText w:val=""/>
+      <w:lvlJc w:val="left"/>
+      <w:pPr>
+        <w:tabs>
+          <w:tab w:val="num" w:pos="5760"/>
+        </w:tabs>
+        <w:ind w:left="5760" w:hanging="360"/>
+      </w:pPr>
+      <w:rPr>
+        <w:rFonts w:ascii="Wingdings" w:hAnsi="Wingdings" w:hint="default"/>
+        <w:sz w:val="20"/>
+      </w:rPr>
+    </w:lvl>
+    <w:lvl w:ilvl="8" w:tentative="1">
+      <w:start w:val="1"/>
+      <w:numFmt w:val="bullet"/>
+      <w:lvlText w:val=""/>
+      <w:lvlJc w:val="left"/>
+      <w:pPr>
+        <w:tabs>
+          <w:tab w:val="num" w:pos="6480"/>
+        </w:tabs>
+        <w:ind w:left="6480" w:hanging="360"/>
+      </w:pPr>
+      <w:rPr>
+        <w:rFonts w:ascii="Wingdings" w:hAnsi="Wingdings" w:hint="default"/>
+        <w:sz w:val="20"/>
+      </w:rPr>
+    </w:lvl>
+  </w:abstractNum>
+  <w:abstractNum w:abstractNumId="3" w15:restartNumberingAfterBreak="0">
+    <w:nsid w:val="38A9615B"/>
+    <w:multiLevelType w:val="multilevel"/>
+    <w:tmpl w:val="7408F878"/>
+    <w:lvl w:ilvl="0">
+      <w:start w:val="1"/>
+      <w:numFmt w:val="bullet"/>
+      <w:lvlText w:val=""/>
+      <w:lvlJc w:val="left"/>
+      <w:pPr>
+        <w:tabs>
+          <w:tab w:val="num" w:pos="720"/>
+        </w:tabs>
+        <w:ind w:left="720" w:hanging="360"/>
+      </w:pPr>
+      <w:rPr>
+        <w:rFonts w:ascii="Symbol" w:hAnsi="Symbol" w:hint="default"/>
+        <w:sz w:val="20"/>
+      </w:rPr>
+    </w:lvl>
+    <w:lvl w:ilvl="1" w:tentative="1">
+      <w:start w:val="1"/>
+      <w:numFmt w:val="bullet"/>
+      <w:lvlText w:val="o"/>
+      <w:lvlJc w:val="left"/>
+      <w:pPr>
+        <w:tabs>
+          <w:tab w:val="num" w:pos="1440"/>
+        </w:tabs>
+        <w:ind w:left="1440" w:hanging="360"/>
+      </w:pPr>
+      <w:rPr>
+        <w:rFonts w:ascii="Courier New" w:hAnsi="Courier New" w:hint="default"/>
+        <w:sz w:val="20"/>
+      </w:rPr>
+    </w:lvl>
+    <w:lvl w:ilvl="2" w:tentative="1">
+      <w:start w:val="1"/>
+      <w:numFmt w:val="bullet"/>
+      <w:lvlText w:val=""/>
+      <w:lvlJc w:val="left"/>
+      <w:pPr>
+        <w:tabs>
+          <w:tab w:val="num" w:pos="2160"/>
+        </w:tabs>
+        <w:ind w:left="2160" w:hanging="360"/>
+      </w:pPr>
+      <w:rPr>
+        <w:rFonts w:ascii="Wingdings" w:hAnsi="Wingdings" w:hint="default"/>
+        <w:sz w:val="20"/>
+      </w:rPr>
+    </w:lvl>
+    <w:lvl w:ilvl="3" w:tentative="1">
+      <w:start w:val="1"/>
+      <w:numFmt w:val="bullet"/>
+      <w:lvlText w:val=""/>
+      <w:lvlJc w:val="left"/>
+      <w:pPr>
+        <w:tabs>
+          <w:tab w:val="num" w:pos="2880"/>
+        </w:tabs>
+        <w:ind w:left="2880" w:hanging="360"/>
+      </w:pPr>
+      <w:rPr>
+        <w:rFonts w:ascii="Wingdings" w:hAnsi="Wingdings" w:hint="default"/>
+        <w:sz w:val="20"/>
+      </w:rPr>
+    </w:lvl>
+    <w:lvl w:ilvl="4" w:tentative="1">
+      <w:start w:val="1"/>
+      <w:numFmt w:val="bullet"/>
+      <w:lvlText w:val=""/>
+      <w:lvlJc w:val="left"/>
+      <w:pPr>
+        <w:tabs>
+          <w:tab w:val="num" w:pos="3600"/>
+        </w:tabs>
+        <w:ind w:left="3600" w:hanging="360"/>
+      </w:pPr>
+      <w:rPr>
+        <w:rFonts w:ascii="Wingdings" w:hAnsi="Wingdings" w:hint="default"/>
+        <w:sz w:val="20"/>
+      </w:rPr>
+    </w:lvl>
+    <w:lvl w:ilvl="5" w:tentative="1">
+      <w:start w:val="1"/>
+      <w:numFmt w:val="bullet"/>
+      <w:lvlText w:val=""/>
+      <w:lvlJc w:val="left"/>
+      <w:pPr>
+        <w:tabs>
+          <w:tab w:val="num" w:pos="4320"/>
+        </w:tabs>
+        <w:ind w:left="4320" w:hanging="360"/>
+      </w:pPr>
+      <w:rPr>
+        <w:rFonts w:ascii="Wingdings" w:hAnsi="Wingdings" w:hint="default"/>
+        <w:sz w:val="20"/>
+      </w:rPr>
+    </w:lvl>
+    <w:lvl w:ilvl="6" w:tentative="1">
+      <w:start w:val="1"/>
+      <w:numFmt w:val="bullet"/>
+      <w:lvlText w:val=""/>
+      <w:lvlJc w:val="left"/>
+      <w:pPr>
+        <w:tabs>
+          <w:tab w:val="num" w:pos="5040"/>
+        </w:tabs>
+        <w:ind w:left="5040" w:hanging="360"/>
+      </w:pPr>
+      <w:rPr>
+        <w:rFonts w:ascii="Wingdings" w:hAnsi="Wingdings" w:hint="default"/>
+        <w:sz w:val="20"/>
+      </w:rPr>
+    </w:lvl>
+    <w:lvl w:ilvl="7" w:tentative="1">
+      <w:start w:val="1"/>
+      <w:numFmt w:val="bullet"/>
+      <w:lvlText w:val=""/>
+      <w:lvlJc w:val="left"/>
+      <w:pPr>
+        <w:tabs>
+          <w:tab w:val="num" w:pos="5760"/>
+        </w:tabs>
+        <w:ind w:left="5760" w:hanging="360"/>
+      </w:pPr>
+      <w:rPr>
+        <w:rFonts w:ascii="Wingdings" w:hAnsi="Wingdings" w:hint="default"/>
+        <w:sz w:val="20"/>
+      </w:rPr>
+    </w:lvl>
+    <w:lvl w:ilvl="8" w:tentative="1">
+      <w:start w:val="1"/>
+      <w:numFmt w:val="bullet"/>
+      <w:lvlText w:val=""/>
+      <w:lvlJc w:val="left"/>
+      <w:pPr>
+        <w:tabs>
+          <w:tab w:val="num" w:pos="6480"/>
+        </w:tabs>
+        <w:ind w:left="6480" w:hanging="360"/>
+      </w:pPr>
+      <w:rPr>
+        <w:rFonts w:ascii="Wingdings" w:hAnsi="Wingdings" w:hint="default"/>
+        <w:sz w:val="20"/>
+      </w:rPr>
+    </w:lvl>
+  </w:abstractNum>
+  <w:abstractNum w:abstractNumId="4" w15:restartNumberingAfterBreak="0">
+    <w:nsid w:val="38F83670"/>
+    <w:multiLevelType w:val="multilevel"/>
+    <w:tmpl w:val="6DB8CD96"/>
+    <w:lvl w:ilvl="0">
+      <w:start w:val="1"/>
+      <w:numFmt w:val="bullet"/>
+      <w:lvlText w:val=""/>
+      <w:lvlJc w:val="left"/>
+      <w:pPr>
+        <w:tabs>
+          <w:tab w:val="num" w:pos="720"/>
+        </w:tabs>
+        <w:ind w:left="720" w:hanging="360"/>
+      </w:pPr>
+      <w:rPr>
+        <w:rFonts w:ascii="Symbol" w:hAnsi="Symbol" w:hint="default"/>
+        <w:sz w:val="20"/>
+      </w:rPr>
+    </w:lvl>
+    <w:lvl w:ilvl="1" w:tentative="1">
+      <w:start w:val="1"/>
+      <w:numFmt w:val="bullet"/>
+      <w:lvlText w:val="o"/>
+      <w:lvlJc w:val="left"/>
+      <w:pPr>
+        <w:tabs>
+          <w:tab w:val="num" w:pos="1440"/>
+        </w:tabs>
+        <w:ind w:left="1440" w:hanging="360"/>
+      </w:pPr>
+      <w:rPr>
+        <w:rFonts w:ascii="Courier New" w:hAnsi="Courier New" w:hint="default"/>
+        <w:sz w:val="20"/>
+      </w:rPr>
+    </w:lvl>
+    <w:lvl w:ilvl="2" w:tentative="1">
+      <w:start w:val="1"/>
+      <w:numFmt w:val="bullet"/>
+      <w:lvlText w:val=""/>
+      <w:lvlJc w:val="left"/>
+      <w:pPr>
+        <w:tabs>
+          <w:tab w:val="num" w:pos="2160"/>
+        </w:tabs>
+        <w:ind w:left="2160" w:hanging="360"/>
+      </w:pPr>
+      <w:rPr>
+        <w:rFonts w:ascii="Wingdings" w:hAnsi="Wingdings" w:hint="default"/>
+        <w:sz w:val="20"/>
+      </w:rPr>
+    </w:lvl>
+    <w:lvl w:ilvl="3" w:tentative="1">
+      <w:start w:val="1"/>
+      <w:numFmt w:val="bullet"/>
+      <w:lvlText w:val=""/>
+      <w:lvlJc w:val="left"/>
+      <w:pPr>
+        <w:tabs>
+          <w:tab w:val="num" w:pos="2880"/>
+        </w:tabs>
+        <w:ind w:left="2880" w:hanging="360"/>
+      </w:pPr>
+      <w:rPr>
+        <w:rFonts w:ascii="Wingdings" w:hAnsi="Wingdings" w:hint="default"/>
+        <w:sz w:val="20"/>
+      </w:rPr>
+    </w:lvl>
+    <w:lvl w:ilvl="4" w:tentative="1">
+      <w:start w:val="1"/>
+      <w:numFmt w:val="bullet"/>
+      <w:lvlText w:val=""/>
+      <w:lvlJc w:val="left"/>
+      <w:pPr>
+        <w:tabs>
+          <w:tab w:val="num" w:pos="3600"/>
+        </w:tabs>
+        <w:ind w:left="3600" w:hanging="360"/>
+      </w:pPr>
+      <w:rPr>
+        <w:rFonts w:ascii="Wingdings" w:hAnsi="Wingdings" w:hint="default"/>
+        <w:sz w:val="20"/>
+      </w:rPr>
+    </w:lvl>
+    <w:lvl w:ilvl="5" w:tentative="1">
+      <w:start w:val="1"/>
+      <w:numFmt w:val="bullet"/>
+      <w:lvlText w:val=""/>
+      <w:lvlJc w:val="left"/>
+      <w:pPr>
+        <w:tabs>
+          <w:tab w:val="num" w:pos="4320"/>
+        </w:tabs>
+        <w:ind w:left="4320" w:hanging="360"/>
+      </w:pPr>
+      <w:rPr>
+        <w:rFonts w:ascii="Wingdings" w:hAnsi="Wingdings" w:hint="default"/>
+        <w:sz w:val="20"/>
+      </w:rPr>
+    </w:lvl>
+    <w:lvl w:ilvl="6" w:tentative="1">
+      <w:start w:val="1"/>
+      <w:numFmt w:val="bullet"/>
+      <w:lvlText w:val=""/>
+      <w:lvlJc w:val="left"/>
+      <w:pPr>
+        <w:tabs>
+          <w:tab w:val="num" w:pos="5040"/>
+        </w:tabs>
+        <w:ind w:left="5040" w:hanging="360"/>
+      </w:pPr>
+      <w:rPr>
+        <w:rFonts w:ascii="Wingdings" w:hAnsi="Wingdings" w:hint="default"/>
+        <w:sz w:val="20"/>
+      </w:rPr>
+    </w:lvl>
+    <w:lvl w:ilvl="7" w:tentative="1">
+      <w:start w:val="1"/>
+      <w:numFmt w:val="bullet"/>
+      <w:lvlText w:val=""/>
+      <w:lvlJc w:val="left"/>
+      <w:pPr>
+        <w:tabs>
+          <w:tab w:val="num" w:pos="5760"/>
+        </w:tabs>
+        <w:ind w:left="5760" w:hanging="360"/>
+      </w:pPr>
+      <w:rPr>
+        <w:rFonts w:ascii="Wingdings" w:hAnsi="Wingdings" w:hint="default"/>
+        <w:sz w:val="20"/>
+      </w:rPr>
+    </w:lvl>
+    <w:lvl w:ilvl="8" w:tentative="1">
+      <w:start w:val="1"/>
+      <w:numFmt w:val="bullet"/>
+      <w:lvlText w:val=""/>
+      <w:lvlJc w:val="left"/>
+      <w:pPr>
+        <w:tabs>
+          <w:tab w:val="num" w:pos="6480"/>
+        </w:tabs>
+        <w:ind w:left="6480" w:hanging="360"/>
+      </w:pPr>
+      <w:rPr>
+        <w:rFonts w:ascii="Wingdings" w:hAnsi="Wingdings" w:hint="default"/>
+        <w:sz w:val="20"/>
+      </w:rPr>
+    </w:lvl>
+  </w:abstractNum>
+  <w:abstractNum w:abstractNumId="5" w15:restartNumberingAfterBreak="0">
+    <w:nsid w:val="42ED3EF6"/>
+    <w:multiLevelType w:val="multilevel"/>
+    <w:tmpl w:val="3FA04150"/>
+    <w:lvl w:ilvl="0">
+      <w:start w:val="1"/>
+      <w:numFmt w:val="bullet"/>
+      <w:lvlText w:val=""/>
+      <w:lvlJc w:val="left"/>
+      <w:pPr>
+        <w:tabs>
+          <w:tab w:val="num" w:pos="720"/>
+        </w:tabs>
+        <w:ind w:left="720" w:hanging="360"/>
+      </w:pPr>
+      <w:rPr>
+        <w:rFonts w:ascii="Symbol" w:hAnsi="Symbol" w:hint="default"/>
+        <w:sz w:val="20"/>
+      </w:rPr>
+    </w:lvl>
+    <w:lvl w:ilvl="1" w:tentative="1">
+      <w:start w:val="1"/>
+      <w:numFmt w:val="bullet"/>
+      <w:lvlText w:val="o"/>
+      <w:lvlJc w:val="left"/>
+      <w:pPr>
+        <w:tabs>
+          <w:tab w:val="num" w:pos="1440"/>
+        </w:tabs>
+        <w:ind w:left="1440" w:hanging="360"/>
+      </w:pPr>
+      <w:rPr>
+        <w:rFonts w:ascii="Courier New" w:hAnsi="Courier New" w:hint="default"/>
+        <w:sz w:val="20"/>
+      </w:rPr>
+    </w:lvl>
+    <w:lvl w:ilvl="2" w:tentative="1">
+      <w:start w:val="1"/>
+      <w:numFmt w:val="bullet"/>
+      <w:lvlText w:val=""/>
+      <w:lvlJc w:val="left"/>
+      <w:pPr>
+        <w:tabs>
+          <w:tab w:val="num" w:pos="2160"/>
+        </w:tabs>
+        <w:ind w:left="2160" w:hanging="360"/>
+      </w:pPr>
+      <w:rPr>
+        <w:rFonts w:ascii="Wingdings" w:hAnsi="Wingdings" w:hint="default"/>
+        <w:sz w:val="20"/>
+      </w:rPr>
+    </w:lvl>
+    <w:lvl w:ilvl="3" w:tentative="1">
+      <w:start w:val="1"/>
+      <w:numFmt w:val="bullet"/>
+      <w:lvlText w:val=""/>
+      <w:lvlJc w:val="left"/>
+      <w:pPr>
+        <w:tabs>
+          <w:tab w:val="num" w:pos="2880"/>
+        </w:tabs>
+        <w:ind w:left="2880" w:hanging="360"/>
+      </w:pPr>
+      <w:rPr>
+        <w:rFonts w:ascii="Wingdings" w:hAnsi="Wingdings" w:hint="default"/>
+        <w:sz w:val="20"/>
+      </w:rPr>
+    </w:lvl>
+    <w:lvl w:ilvl="4" w:tentative="1">
+      <w:start w:val="1"/>
+      <w:numFmt w:val="bullet"/>
+      <w:lvlText w:val=""/>
+      <w:lvlJc w:val="left"/>
+      <w:pPr>
+        <w:tabs>
+          <w:tab w:val="num" w:pos="3600"/>
+        </w:tabs>
+        <w:ind w:left="3600" w:hanging="360"/>
+      </w:pPr>
+      <w:rPr>
+        <w:rFonts w:ascii="Wingdings" w:hAnsi="Wingdings" w:hint="default"/>
+        <w:sz w:val="20"/>
+      </w:rPr>
+    </w:lvl>
+    <w:lvl w:ilvl="5" w:tentative="1">
+      <w:start w:val="1"/>
+      <w:numFmt w:val="bullet"/>
+      <w:lvlText w:val=""/>
+      <w:lvlJc w:val="left"/>
+      <w:pPr>
+        <w:tabs>
+          <w:tab w:val="num" w:pos="4320"/>
+        </w:tabs>
+        <w:ind w:left="4320" w:hanging="360"/>
+      </w:pPr>
+      <w:rPr>
+        <w:rFonts w:ascii="Wingdings" w:hAnsi="Wingdings" w:hint="default"/>
+        <w:sz w:val="20"/>
+      </w:rPr>
+    </w:lvl>
+    <w:lvl w:ilvl="6" w:tentative="1">
+      <w:start w:val="1"/>
+      <w:numFmt w:val="bullet"/>
+      <w:lvlText w:val=""/>
+      <w:lvlJc w:val="left"/>
+      <w:pPr>
+        <w:tabs>
+          <w:tab w:val="num" w:pos="5040"/>
+        </w:tabs>
+        <w:ind w:left="5040" w:hanging="360"/>
+      </w:pPr>
+      <w:rPr>
+        <w:rFonts w:ascii="Wingdings" w:hAnsi="Wingdings" w:hint="default"/>
+        <w:sz w:val="20"/>
+      </w:rPr>
+    </w:lvl>
+    <w:lvl w:ilvl="7" w:tentative="1">
+      <w:start w:val="1"/>
+      <w:numFmt w:val="bullet"/>
+      <w:lvlText w:val=""/>
+      <w:lvlJc w:val="left"/>
+      <w:pPr>
+        <w:tabs>
+          <w:tab w:val="num" w:pos="5760"/>
+        </w:tabs>
+        <w:ind w:left="5760" w:hanging="360"/>
+      </w:pPr>
+      <w:rPr>
+        <w:rFonts w:ascii="Wingdings" w:hAnsi="Wingdings" w:hint="default"/>
+        <w:sz w:val="20"/>
+      </w:rPr>
+    </w:lvl>
+    <w:lvl w:ilvl="8" w:tentative="1">
+      <w:start w:val="1"/>
+      <w:numFmt w:val="bullet"/>
+      <w:lvlText w:val=""/>
+      <w:lvlJc w:val="left"/>
+      <w:pPr>
+        <w:tabs>
+          <w:tab w:val="num" w:pos="6480"/>
+        </w:tabs>
+        <w:ind w:left="6480" w:hanging="360"/>
+      </w:pPr>
+      <w:rPr>
+        <w:rFonts w:ascii="Wingdings" w:hAnsi="Wingdings" w:hint="default"/>
+        <w:sz w:val="20"/>
+      </w:rPr>
+    </w:lvl>
+  </w:abstractNum>
+  <w:abstractNum w:abstractNumId="6" w15:restartNumberingAfterBreak="0">
+    <w:nsid w:val="52A70E58"/>
+    <w:multiLevelType w:val="multilevel"/>
+    <w:tmpl w:val="F8CE9C6A"/>
+    <w:lvl w:ilvl="0">
+      <w:start w:val="1"/>
+      <w:numFmt w:val="bullet"/>
+      <w:lvlText w:val=""/>
+      <w:lvlJc w:val="left"/>
+      <w:pPr>
+        <w:tabs>
+          <w:tab w:val="num" w:pos="720"/>
+        </w:tabs>
+        <w:ind w:left="720" w:hanging="360"/>
+      </w:pPr>
+      <w:rPr>
+        <w:rFonts w:ascii="Symbol" w:hAnsi="Symbol" w:hint="default"/>
+        <w:sz w:val="20"/>
+      </w:rPr>
+    </w:lvl>
+    <w:lvl w:ilvl="1" w:tentative="1">
+      <w:start w:val="1"/>
+      <w:numFmt w:val="bullet"/>
+      <w:lvlText w:val="o"/>
+      <w:lvlJc w:val="left"/>
+      <w:pPr>
+        <w:tabs>
+          <w:tab w:val="num" w:pos="1440"/>
+        </w:tabs>
+        <w:ind w:left="1440" w:hanging="360"/>
+      </w:pPr>
+      <w:rPr>
+        <w:rFonts w:ascii="Courier New" w:hAnsi="Courier New" w:hint="default"/>
+        <w:sz w:val="20"/>
+      </w:rPr>
+    </w:lvl>
+    <w:lvl w:ilvl="2" w:tentative="1">
+      <w:start w:val="1"/>
+      <w:numFmt w:val="bullet"/>
+      <w:lvlText w:val=""/>
+      <w:lvlJc w:val="left"/>
+      <w:pPr>
+        <w:tabs>
+          <w:tab w:val="num" w:pos="2160"/>
+        </w:tabs>
+        <w:ind w:left="2160" w:hanging="360"/>
+      </w:pPr>
+      <w:rPr>
+        <w:rFonts w:ascii="Wingdings" w:hAnsi="Wingdings" w:hint="default"/>
+        <w:sz w:val="20"/>
+      </w:rPr>
+    </w:lvl>
+    <w:lvl w:ilvl="3" w:tentative="1">
+      <w:start w:val="1"/>
+      <w:numFmt w:val="bullet"/>
+      <w:lvlText w:val=""/>
+      <w:lvlJc w:val="left"/>
+      <w:pPr>
+        <w:tabs>
+          <w:tab w:val="num" w:pos="2880"/>
+        </w:tabs>
+        <w:ind w:left="2880" w:hanging="360"/>
+      </w:pPr>
+      <w:rPr>
+        <w:rFonts w:ascii="Wingdings" w:hAnsi="Wingdings" w:hint="default"/>
+        <w:sz w:val="20"/>
+      </w:rPr>
+    </w:lvl>
+    <w:lvl w:ilvl="4" w:tentative="1">
+      <w:start w:val="1"/>
+      <w:numFmt w:val="bullet"/>
+      <w:lvlText w:val=""/>
+      <w:lvlJc w:val="left"/>
+      <w:pPr>
+        <w:tabs>
+          <w:tab w:val="num" w:pos="3600"/>
+        </w:tabs>
+        <w:ind w:left="3600" w:hanging="360"/>
+      </w:pPr>
+      <w:rPr>
+        <w:rFonts w:ascii="Wingdings" w:hAnsi="Wingdings" w:hint="default"/>
+        <w:sz w:val="20"/>
+      </w:rPr>
+    </w:lvl>
+    <w:lvl w:ilvl="5" w:tentative="1">
+      <w:start w:val="1"/>
+      <w:numFmt w:val="bullet"/>
+      <w:lvlText w:val=""/>
+      <w:lvlJc w:val="left"/>
+      <w:pPr>
+        <w:tabs>
+          <w:tab w:val="num" w:pos="4320"/>
+        </w:tabs>
+        <w:ind w:left="4320" w:hanging="360"/>
+      </w:pPr>
+      <w:rPr>
+        <w:rFonts w:ascii="Wingdings" w:hAnsi="Wingdings" w:hint="default"/>
+        <w:sz w:val="20"/>
+      </w:rPr>
+    </w:lvl>
+    <w:lvl w:ilvl="6" w:tentative="1">
+      <w:start w:val="1"/>
+      <w:numFmt w:val="bullet"/>
+      <w:lvlText w:val=""/>
+      <w:lvlJc w:val="left"/>
+      <w:pPr>
+        <w:tabs>
+          <w:tab w:val="num" w:pos="5040"/>
+        </w:tabs>
+        <w:ind w:left="5040" w:hanging="360"/>
+      </w:pPr>
+      <w:rPr>
+        <w:rFonts w:ascii="Wingdings" w:hAnsi="Wingdings" w:hint="default"/>
+        <w:sz w:val="20"/>
+      </w:rPr>
+    </w:lvl>
+    <w:lvl w:ilvl="7" w:tentative="1">
+      <w:start w:val="1"/>
+      <w:numFmt w:val="bullet"/>
+      <w:lvlText w:val=""/>
+      <w:lvlJc w:val="left"/>
+      <w:pPr>
+        <w:tabs>
+          <w:tab w:val="num" w:pos="5760"/>
+        </w:tabs>
+        <w:ind w:left="5760" w:hanging="360"/>
+      </w:pPr>
+      <w:rPr>
+        <w:rFonts w:ascii="Wingdings" w:hAnsi="Wingdings" w:hint="default"/>
+        <w:sz w:val="20"/>
+      </w:rPr>
+    </w:lvl>
+    <w:lvl w:ilvl="8" w:tentative="1">
+      <w:start w:val="1"/>
+      <w:numFmt w:val="bullet"/>
+      <w:lvlText w:val=""/>
+      <w:lvlJc w:val="left"/>
+      <w:pPr>
+        <w:tabs>
+          <w:tab w:val="num" w:pos="6480"/>
+        </w:tabs>
+        <w:ind w:left="6480" w:hanging="360"/>
+      </w:pPr>
+      <w:rPr>
+        <w:rFonts w:ascii="Wingdings" w:hAnsi="Wingdings" w:hint="default"/>
+        <w:sz w:val="20"/>
+      </w:rPr>
+    </w:lvl>
+  </w:abstractNum>
+  <w:abstractNum w:abstractNumId="7" w15:restartNumberingAfterBreak="0">
+    <w:nsid w:val="5CD23837"/>
+    <w:multiLevelType w:val="multilevel"/>
+    <w:tmpl w:val="D04817C8"/>
+    <w:lvl w:ilvl="0">
+      <w:start w:val="1"/>
+      <w:numFmt w:val="bullet"/>
+      <w:lvlText w:val=""/>
+      <w:lvlJc w:val="left"/>
+      <w:pPr>
+        <w:tabs>
+          <w:tab w:val="num" w:pos="720"/>
+        </w:tabs>
+        <w:ind w:left="720" w:hanging="360"/>
+      </w:pPr>
+      <w:rPr>
+        <w:rFonts w:ascii="Symbol" w:hAnsi="Symbol" w:hint="default"/>
+        <w:sz w:val="20"/>
+      </w:rPr>
+    </w:lvl>
+    <w:lvl w:ilvl="1" w:tentative="1">
+      <w:start w:val="1"/>
+      <w:numFmt w:val="bullet"/>
+      <w:lvlText w:val="o"/>
+      <w:lvlJc w:val="left"/>
+      <w:pPr>
+        <w:tabs>
+          <w:tab w:val="num" w:pos="1440"/>
+        </w:tabs>
+        <w:ind w:left="1440" w:hanging="360"/>
+      </w:pPr>
+      <w:rPr>
+        <w:rFonts w:ascii="Courier New" w:hAnsi="Courier New" w:hint="default"/>
+        <w:sz w:val="20"/>
+      </w:rPr>
+    </w:lvl>
+    <w:lvl w:ilvl="2" w:tentative="1">
+      <w:start w:val="1"/>
+      <w:numFmt w:val="bullet"/>
+      <w:lvlText w:val=""/>
+      <w:lvlJc w:val="left"/>
+      <w:pPr>
+        <w:tabs>
+          <w:tab w:val="num" w:pos="2160"/>
+        </w:tabs>
+        <w:ind w:left="2160" w:hanging="360"/>
+      </w:pPr>
+      <w:rPr>
+        <w:rFonts w:ascii="Wingdings" w:hAnsi="Wingdings" w:hint="default"/>
+        <w:sz w:val="20"/>
+      </w:rPr>
+    </w:lvl>
+    <w:lvl w:ilvl="3" w:tentative="1">
+      <w:start w:val="1"/>
+      <w:numFmt w:val="bullet"/>
+      <w:lvlText w:val=""/>
+      <w:lvlJc w:val="left"/>
+      <w:pPr>
+        <w:tabs>
+          <w:tab w:val="num" w:pos="2880"/>
+        </w:tabs>
+        <w:ind w:left="2880" w:hanging="360"/>
+      </w:pPr>
+      <w:rPr>
+        <w:rFonts w:ascii="Wingdings" w:hAnsi="Wingdings" w:hint="default"/>
+        <w:sz w:val="20"/>
+      </w:rPr>
+    </w:lvl>
+    <w:lvl w:ilvl="4" w:tentative="1">
+      <w:start w:val="1"/>
+      <w:numFmt w:val="bullet"/>
+      <w:lvlText w:val=""/>
+      <w:lvlJc w:val="left"/>
+      <w:pPr>
+        <w:tabs>
+          <w:tab w:val="num" w:pos="3600"/>
+        </w:tabs>
+        <w:ind w:left="3600" w:hanging="360"/>
+      </w:pPr>
+      <w:rPr>
+        <w:rFonts w:ascii="Wingdings" w:hAnsi="Wingdings" w:hint="default"/>
+        <w:sz w:val="20"/>
+      </w:rPr>
+    </w:lvl>
+    <w:lvl w:ilvl="5" w:tentative="1">
+      <w:start w:val="1"/>
+      <w:numFmt w:val="bullet"/>
+      <w:lvlText w:val=""/>
+      <w:lvlJc w:val="left"/>
+      <w:pPr>
+        <w:tabs>
+          <w:tab w:val="num" w:pos="4320"/>
+        </w:tabs>
+        <w:ind w:left="4320" w:hanging="360"/>
+      </w:pPr>
+      <w:rPr>
+        <w:rFonts w:ascii="Wingdings" w:hAnsi="Wingdings" w:hint="default"/>
+        <w:sz w:val="20"/>
+      </w:rPr>
+    </w:lvl>
+    <w:lvl w:ilvl="6" w:tentative="1">
+      <w:start w:val="1"/>
+      <w:numFmt w:val="bullet"/>
+      <w:lvlText w:val=""/>
+      <w:lvlJc w:val="left"/>
+      <w:pPr>
+        <w:tabs>
+          <w:tab w:val="num" w:pos="5040"/>
+        </w:tabs>
+        <w:ind w:left="5040" w:hanging="360"/>
+      </w:pPr>
+      <w:rPr>
+        <w:rFonts w:ascii="Wingdings" w:hAnsi="Wingdings" w:hint="default"/>
+        <w:sz w:val="20"/>
+      </w:rPr>
+    </w:lvl>
+    <w:lvl w:ilvl="7" w:tentative="1">
+      <w:start w:val="1"/>
+      <w:numFmt w:val="bullet"/>
+      <w:lvlText w:val=""/>
+      <w:lvlJc w:val="left"/>
+      <w:pPr>
+        <w:tabs>
+          <w:tab w:val="num" w:pos="5760"/>
+        </w:tabs>
+        <w:ind w:left="5760" w:hanging="360"/>
+      </w:pPr>
+      <w:rPr>
+        <w:rFonts w:ascii="Wingdings" w:hAnsi="Wingdings" w:hint="default"/>
+        <w:sz w:val="20"/>
+      </w:rPr>
+    </w:lvl>
+    <w:lvl w:ilvl="8" w:tentative="1">
+      <w:start w:val="1"/>
+      <w:numFmt w:val="bullet"/>
+      <w:lvlText w:val=""/>
+      <w:lvlJc w:val="left"/>
+      <w:pPr>
+        <w:tabs>
+          <w:tab w:val="num" w:pos="6480"/>
+        </w:tabs>
+        <w:ind w:left="6480" w:hanging="360"/>
+      </w:pPr>
+      <w:rPr>
+        <w:rFonts w:ascii="Wingdings" w:hAnsi="Wingdings" w:hint="default"/>
+        <w:sz w:val="20"/>
+      </w:rPr>
+    </w:lvl>
+  </w:abstractNum>
+  <w:abstractNum w:abstractNumId="8" w15:restartNumberingAfterBreak="0">
     <w:nsid w:val="612E6659"/>
     <w:multiLevelType w:val="hybridMultilevel"/>
     <w:tmpl w:val="B35C4CE0"/>
@@ -635,8 +2870,640 @@
       </w:pPr>
     </w:lvl>
   </w:abstractNum>
+  <w:abstractNum w:abstractNumId="9" w15:restartNumberingAfterBreak="0">
+    <w:nsid w:val="613B60FA"/>
+    <w:multiLevelType w:val="multilevel"/>
+    <w:tmpl w:val="4864B966"/>
+    <w:lvl w:ilvl="0">
+      <w:start w:val="1"/>
+      <w:numFmt w:val="bullet"/>
+      <w:lvlText w:val=""/>
+      <w:lvlJc w:val="left"/>
+      <w:pPr>
+        <w:tabs>
+          <w:tab w:val="num" w:pos="720"/>
+        </w:tabs>
+        <w:ind w:left="720" w:hanging="360"/>
+      </w:pPr>
+      <w:rPr>
+        <w:rFonts w:ascii="Symbol" w:hAnsi="Symbol" w:hint="default"/>
+        <w:sz w:val="20"/>
+      </w:rPr>
+    </w:lvl>
+    <w:lvl w:ilvl="1" w:tentative="1">
+      <w:start w:val="1"/>
+      <w:numFmt w:val="bullet"/>
+      <w:lvlText w:val="o"/>
+      <w:lvlJc w:val="left"/>
+      <w:pPr>
+        <w:tabs>
+          <w:tab w:val="num" w:pos="1440"/>
+        </w:tabs>
+        <w:ind w:left="1440" w:hanging="360"/>
+      </w:pPr>
+      <w:rPr>
+        <w:rFonts w:ascii="Courier New" w:hAnsi="Courier New" w:hint="default"/>
+        <w:sz w:val="20"/>
+      </w:rPr>
+    </w:lvl>
+    <w:lvl w:ilvl="2" w:tentative="1">
+      <w:start w:val="1"/>
+      <w:numFmt w:val="bullet"/>
+      <w:lvlText w:val=""/>
+      <w:lvlJc w:val="left"/>
+      <w:pPr>
+        <w:tabs>
+          <w:tab w:val="num" w:pos="2160"/>
+        </w:tabs>
+        <w:ind w:left="2160" w:hanging="360"/>
+      </w:pPr>
+      <w:rPr>
+        <w:rFonts w:ascii="Wingdings" w:hAnsi="Wingdings" w:hint="default"/>
+        <w:sz w:val="20"/>
+      </w:rPr>
+    </w:lvl>
+    <w:lvl w:ilvl="3" w:tentative="1">
+      <w:start w:val="1"/>
+      <w:numFmt w:val="bullet"/>
+      <w:lvlText w:val=""/>
+      <w:lvlJc w:val="left"/>
+      <w:pPr>
+        <w:tabs>
+          <w:tab w:val="num" w:pos="2880"/>
+        </w:tabs>
+        <w:ind w:left="2880" w:hanging="360"/>
+      </w:pPr>
+      <w:rPr>
+        <w:rFonts w:ascii="Wingdings" w:hAnsi="Wingdings" w:hint="default"/>
+        <w:sz w:val="20"/>
+      </w:rPr>
+    </w:lvl>
+    <w:lvl w:ilvl="4" w:tentative="1">
+      <w:start w:val="1"/>
+      <w:numFmt w:val="bullet"/>
+      <w:lvlText w:val=""/>
+      <w:lvlJc w:val="left"/>
+      <w:pPr>
+        <w:tabs>
+          <w:tab w:val="num" w:pos="3600"/>
+        </w:tabs>
+        <w:ind w:left="3600" w:hanging="360"/>
+      </w:pPr>
+      <w:rPr>
+        <w:rFonts w:ascii="Wingdings" w:hAnsi="Wingdings" w:hint="default"/>
+        <w:sz w:val="20"/>
+      </w:rPr>
+    </w:lvl>
+    <w:lvl w:ilvl="5" w:tentative="1">
+      <w:start w:val="1"/>
+      <w:numFmt w:val="bullet"/>
+      <w:lvlText w:val=""/>
+      <w:lvlJc w:val="left"/>
+      <w:pPr>
+        <w:tabs>
+          <w:tab w:val="num" w:pos="4320"/>
+        </w:tabs>
+        <w:ind w:left="4320" w:hanging="360"/>
+      </w:pPr>
+      <w:rPr>
+        <w:rFonts w:ascii="Wingdings" w:hAnsi="Wingdings" w:hint="default"/>
+        <w:sz w:val="20"/>
+      </w:rPr>
+    </w:lvl>
+    <w:lvl w:ilvl="6" w:tentative="1">
+      <w:start w:val="1"/>
+      <w:numFmt w:val="bullet"/>
+      <w:lvlText w:val=""/>
+      <w:lvlJc w:val="left"/>
+      <w:pPr>
+        <w:tabs>
+          <w:tab w:val="num" w:pos="5040"/>
+        </w:tabs>
+        <w:ind w:left="5040" w:hanging="360"/>
+      </w:pPr>
+      <w:rPr>
+        <w:rFonts w:ascii="Wingdings" w:hAnsi="Wingdings" w:hint="default"/>
+        <w:sz w:val="20"/>
+      </w:rPr>
+    </w:lvl>
+    <w:lvl w:ilvl="7" w:tentative="1">
+      <w:start w:val="1"/>
+      <w:numFmt w:val="bullet"/>
+      <w:lvlText w:val=""/>
+      <w:lvlJc w:val="left"/>
+      <w:pPr>
+        <w:tabs>
+          <w:tab w:val="num" w:pos="5760"/>
+        </w:tabs>
+        <w:ind w:left="5760" w:hanging="360"/>
+      </w:pPr>
+      <w:rPr>
+        <w:rFonts w:ascii="Wingdings" w:hAnsi="Wingdings" w:hint="default"/>
+        <w:sz w:val="20"/>
+      </w:rPr>
+    </w:lvl>
+    <w:lvl w:ilvl="8" w:tentative="1">
+      <w:start w:val="1"/>
+      <w:numFmt w:val="bullet"/>
+      <w:lvlText w:val=""/>
+      <w:lvlJc w:val="left"/>
+      <w:pPr>
+        <w:tabs>
+          <w:tab w:val="num" w:pos="6480"/>
+        </w:tabs>
+        <w:ind w:left="6480" w:hanging="360"/>
+      </w:pPr>
+      <w:rPr>
+        <w:rFonts w:ascii="Wingdings" w:hAnsi="Wingdings" w:hint="default"/>
+        <w:sz w:val="20"/>
+      </w:rPr>
+    </w:lvl>
+  </w:abstractNum>
+  <w:abstractNum w:abstractNumId="10" w15:restartNumberingAfterBreak="0">
+    <w:nsid w:val="62006C54"/>
+    <w:multiLevelType w:val="multilevel"/>
+    <w:tmpl w:val="27E4AE8E"/>
+    <w:lvl w:ilvl="0">
+      <w:start w:val="1"/>
+      <w:numFmt w:val="bullet"/>
+      <w:lvlText w:val=""/>
+      <w:lvlJc w:val="left"/>
+      <w:pPr>
+        <w:tabs>
+          <w:tab w:val="num" w:pos="720"/>
+        </w:tabs>
+        <w:ind w:left="720" w:hanging="360"/>
+      </w:pPr>
+      <w:rPr>
+        <w:rFonts w:ascii="Symbol" w:hAnsi="Symbol" w:hint="default"/>
+        <w:sz w:val="20"/>
+      </w:rPr>
+    </w:lvl>
+    <w:lvl w:ilvl="1">
+      <w:start w:val="1"/>
+      <w:numFmt w:val="bullet"/>
+      <w:lvlText w:val="o"/>
+      <w:lvlJc w:val="left"/>
+      <w:pPr>
+        <w:tabs>
+          <w:tab w:val="num" w:pos="1440"/>
+        </w:tabs>
+        <w:ind w:left="1440" w:hanging="360"/>
+      </w:pPr>
+      <w:rPr>
+        <w:rFonts w:ascii="Courier New" w:hAnsi="Courier New" w:hint="default"/>
+        <w:sz w:val="20"/>
+      </w:rPr>
+    </w:lvl>
+    <w:lvl w:ilvl="2" w:tentative="1">
+      <w:start w:val="1"/>
+      <w:numFmt w:val="bullet"/>
+      <w:lvlText w:val=""/>
+      <w:lvlJc w:val="left"/>
+      <w:pPr>
+        <w:tabs>
+          <w:tab w:val="num" w:pos="2160"/>
+        </w:tabs>
+        <w:ind w:left="2160" w:hanging="360"/>
+      </w:pPr>
+      <w:rPr>
+        <w:rFonts w:ascii="Wingdings" w:hAnsi="Wingdings" w:hint="default"/>
+        <w:sz w:val="20"/>
+      </w:rPr>
+    </w:lvl>
+    <w:lvl w:ilvl="3" w:tentative="1">
+      <w:start w:val="1"/>
+      <w:numFmt w:val="bullet"/>
+      <w:lvlText w:val=""/>
+      <w:lvlJc w:val="left"/>
+      <w:pPr>
+        <w:tabs>
+          <w:tab w:val="num" w:pos="2880"/>
+        </w:tabs>
+        <w:ind w:left="2880" w:hanging="360"/>
+      </w:pPr>
+      <w:rPr>
+        <w:rFonts w:ascii="Wingdings" w:hAnsi="Wingdings" w:hint="default"/>
+        <w:sz w:val="20"/>
+      </w:rPr>
+    </w:lvl>
+    <w:lvl w:ilvl="4" w:tentative="1">
+      <w:start w:val="1"/>
+      <w:numFmt w:val="bullet"/>
+      <w:lvlText w:val=""/>
+      <w:lvlJc w:val="left"/>
+      <w:pPr>
+        <w:tabs>
+          <w:tab w:val="num" w:pos="3600"/>
+        </w:tabs>
+        <w:ind w:left="3600" w:hanging="360"/>
+      </w:pPr>
+      <w:rPr>
+        <w:rFonts w:ascii="Wingdings" w:hAnsi="Wingdings" w:hint="default"/>
+        <w:sz w:val="20"/>
+      </w:rPr>
+    </w:lvl>
+    <w:lvl w:ilvl="5" w:tentative="1">
+      <w:start w:val="1"/>
+      <w:numFmt w:val="bullet"/>
+      <w:lvlText w:val=""/>
+      <w:lvlJc w:val="left"/>
+      <w:pPr>
+        <w:tabs>
+          <w:tab w:val="num" w:pos="4320"/>
+        </w:tabs>
+        <w:ind w:left="4320" w:hanging="360"/>
+      </w:pPr>
+      <w:rPr>
+        <w:rFonts w:ascii="Wingdings" w:hAnsi="Wingdings" w:hint="default"/>
+        <w:sz w:val="20"/>
+      </w:rPr>
+    </w:lvl>
+    <w:lvl w:ilvl="6" w:tentative="1">
+      <w:start w:val="1"/>
+      <w:numFmt w:val="bullet"/>
+      <w:lvlText w:val=""/>
+      <w:lvlJc w:val="left"/>
+      <w:pPr>
+        <w:tabs>
+          <w:tab w:val="num" w:pos="5040"/>
+        </w:tabs>
+        <w:ind w:left="5040" w:hanging="360"/>
+      </w:pPr>
+      <w:rPr>
+        <w:rFonts w:ascii="Wingdings" w:hAnsi="Wingdings" w:hint="default"/>
+        <w:sz w:val="20"/>
+      </w:rPr>
+    </w:lvl>
+    <w:lvl w:ilvl="7" w:tentative="1">
+      <w:start w:val="1"/>
+      <w:numFmt w:val="bullet"/>
+      <w:lvlText w:val=""/>
+      <w:lvlJc w:val="left"/>
+      <w:pPr>
+        <w:tabs>
+          <w:tab w:val="num" w:pos="5760"/>
+        </w:tabs>
+        <w:ind w:left="5760" w:hanging="360"/>
+      </w:pPr>
+      <w:rPr>
+        <w:rFonts w:ascii="Wingdings" w:hAnsi="Wingdings" w:hint="default"/>
+        <w:sz w:val="20"/>
+      </w:rPr>
+    </w:lvl>
+    <w:lvl w:ilvl="8" w:tentative="1">
+      <w:start w:val="1"/>
+      <w:numFmt w:val="bullet"/>
+      <w:lvlText w:val=""/>
+      <w:lvlJc w:val="left"/>
+      <w:pPr>
+        <w:tabs>
+          <w:tab w:val="num" w:pos="6480"/>
+        </w:tabs>
+        <w:ind w:left="6480" w:hanging="360"/>
+      </w:pPr>
+      <w:rPr>
+        <w:rFonts w:ascii="Wingdings" w:hAnsi="Wingdings" w:hint="default"/>
+        <w:sz w:val="20"/>
+      </w:rPr>
+    </w:lvl>
+  </w:abstractNum>
+  <w:abstractNum w:abstractNumId="11" w15:restartNumberingAfterBreak="0">
+    <w:nsid w:val="6D3E4475"/>
+    <w:multiLevelType w:val="multilevel"/>
+    <w:tmpl w:val="136ECCD4"/>
+    <w:lvl w:ilvl="0">
+      <w:start w:val="1"/>
+      <w:numFmt w:val="bullet"/>
+      <w:lvlText w:val=""/>
+      <w:lvlJc w:val="left"/>
+      <w:pPr>
+        <w:tabs>
+          <w:tab w:val="num" w:pos="720"/>
+        </w:tabs>
+        <w:ind w:left="720" w:hanging="360"/>
+      </w:pPr>
+      <w:rPr>
+        <w:rFonts w:ascii="Symbol" w:hAnsi="Symbol" w:hint="default"/>
+        <w:sz w:val="20"/>
+      </w:rPr>
+    </w:lvl>
+    <w:lvl w:ilvl="1" w:tentative="1">
+      <w:start w:val="1"/>
+      <w:numFmt w:val="bullet"/>
+      <w:lvlText w:val="o"/>
+      <w:lvlJc w:val="left"/>
+      <w:pPr>
+        <w:tabs>
+          <w:tab w:val="num" w:pos="1440"/>
+        </w:tabs>
+        <w:ind w:left="1440" w:hanging="360"/>
+      </w:pPr>
+      <w:rPr>
+        <w:rFonts w:ascii="Courier New" w:hAnsi="Courier New" w:hint="default"/>
+        <w:sz w:val="20"/>
+      </w:rPr>
+    </w:lvl>
+    <w:lvl w:ilvl="2" w:tentative="1">
+      <w:start w:val="1"/>
+      <w:numFmt w:val="bullet"/>
+      <w:lvlText w:val=""/>
+      <w:lvlJc w:val="left"/>
+      <w:pPr>
+        <w:tabs>
+          <w:tab w:val="num" w:pos="2160"/>
+        </w:tabs>
+        <w:ind w:left="2160" w:hanging="360"/>
+      </w:pPr>
+      <w:rPr>
+        <w:rFonts w:ascii="Wingdings" w:hAnsi="Wingdings" w:hint="default"/>
+        <w:sz w:val="20"/>
+      </w:rPr>
+    </w:lvl>
+    <w:lvl w:ilvl="3" w:tentative="1">
+      <w:start w:val="1"/>
+      <w:numFmt w:val="bullet"/>
+      <w:lvlText w:val=""/>
+      <w:lvlJc w:val="left"/>
+      <w:pPr>
+        <w:tabs>
+          <w:tab w:val="num" w:pos="2880"/>
+        </w:tabs>
+        <w:ind w:left="2880" w:hanging="360"/>
+      </w:pPr>
+      <w:rPr>
+        <w:rFonts w:ascii="Wingdings" w:hAnsi="Wingdings" w:hint="default"/>
+        <w:sz w:val="20"/>
+      </w:rPr>
+    </w:lvl>
+    <w:lvl w:ilvl="4" w:tentative="1">
+      <w:start w:val="1"/>
+      <w:numFmt w:val="bullet"/>
+      <w:lvlText w:val=""/>
+      <w:lvlJc w:val="left"/>
+      <w:pPr>
+        <w:tabs>
+          <w:tab w:val="num" w:pos="3600"/>
+        </w:tabs>
+        <w:ind w:left="3600" w:hanging="360"/>
+      </w:pPr>
+      <w:rPr>
+        <w:rFonts w:ascii="Wingdings" w:hAnsi="Wingdings" w:hint="default"/>
+        <w:sz w:val="20"/>
+      </w:rPr>
+    </w:lvl>
+    <w:lvl w:ilvl="5" w:tentative="1">
+      <w:start w:val="1"/>
+      <w:numFmt w:val="bullet"/>
+      <w:lvlText w:val=""/>
+      <w:lvlJc w:val="left"/>
+      <w:pPr>
+        <w:tabs>
+          <w:tab w:val="num" w:pos="4320"/>
+        </w:tabs>
+        <w:ind w:left="4320" w:hanging="360"/>
+      </w:pPr>
+      <w:rPr>
+        <w:rFonts w:ascii="Wingdings" w:hAnsi="Wingdings" w:hint="default"/>
+        <w:sz w:val="20"/>
+      </w:rPr>
+    </w:lvl>
+    <w:lvl w:ilvl="6" w:tentative="1">
+      <w:start w:val="1"/>
+      <w:numFmt w:val="bullet"/>
+      <w:lvlText w:val=""/>
+      <w:lvlJc w:val="left"/>
+      <w:pPr>
+        <w:tabs>
+          <w:tab w:val="num" w:pos="5040"/>
+        </w:tabs>
+        <w:ind w:left="5040" w:hanging="360"/>
+      </w:pPr>
+      <w:rPr>
+        <w:rFonts w:ascii="Wingdings" w:hAnsi="Wingdings" w:hint="default"/>
+        <w:sz w:val="20"/>
+      </w:rPr>
+    </w:lvl>
+    <w:lvl w:ilvl="7" w:tentative="1">
+      <w:start w:val="1"/>
+      <w:numFmt w:val="bullet"/>
+      <w:lvlText w:val=""/>
+      <w:lvlJc w:val="left"/>
+      <w:pPr>
+        <w:tabs>
+          <w:tab w:val="num" w:pos="5760"/>
+        </w:tabs>
+        <w:ind w:left="5760" w:hanging="360"/>
+      </w:pPr>
+      <w:rPr>
+        <w:rFonts w:ascii="Wingdings" w:hAnsi="Wingdings" w:hint="default"/>
+        <w:sz w:val="20"/>
+      </w:rPr>
+    </w:lvl>
+    <w:lvl w:ilvl="8" w:tentative="1">
+      <w:start w:val="1"/>
+      <w:numFmt w:val="bullet"/>
+      <w:lvlText w:val=""/>
+      <w:lvlJc w:val="left"/>
+      <w:pPr>
+        <w:tabs>
+          <w:tab w:val="num" w:pos="6480"/>
+        </w:tabs>
+        <w:ind w:left="6480" w:hanging="360"/>
+      </w:pPr>
+      <w:rPr>
+        <w:rFonts w:ascii="Wingdings" w:hAnsi="Wingdings" w:hint="default"/>
+        <w:sz w:val="20"/>
+      </w:rPr>
+    </w:lvl>
+  </w:abstractNum>
+  <w:abstractNum w:abstractNumId="12" w15:restartNumberingAfterBreak="0">
+    <w:nsid w:val="78743B72"/>
+    <w:multiLevelType w:val="multilevel"/>
+    <w:tmpl w:val="947E3372"/>
+    <w:lvl w:ilvl="0">
+      <w:start w:val="1"/>
+      <w:numFmt w:val="bullet"/>
+      <w:lvlText w:val=""/>
+      <w:lvlJc w:val="left"/>
+      <w:pPr>
+        <w:tabs>
+          <w:tab w:val="num" w:pos="720"/>
+        </w:tabs>
+        <w:ind w:left="720" w:hanging="360"/>
+      </w:pPr>
+      <w:rPr>
+        <w:rFonts w:ascii="Symbol" w:hAnsi="Symbol" w:hint="default"/>
+        <w:sz w:val="20"/>
+      </w:rPr>
+    </w:lvl>
+    <w:lvl w:ilvl="1" w:tentative="1">
+      <w:start w:val="1"/>
+      <w:numFmt w:val="bullet"/>
+      <w:lvlText w:val="o"/>
+      <w:lvlJc w:val="left"/>
+      <w:pPr>
+        <w:tabs>
+          <w:tab w:val="num" w:pos="1440"/>
+        </w:tabs>
+        <w:ind w:left="1440" w:hanging="360"/>
+      </w:pPr>
+      <w:rPr>
+        <w:rFonts w:ascii="Courier New" w:hAnsi="Courier New" w:hint="default"/>
+        <w:sz w:val="20"/>
+      </w:rPr>
+    </w:lvl>
+    <w:lvl w:ilvl="2" w:tentative="1">
+      <w:start w:val="1"/>
+      <w:numFmt w:val="bullet"/>
+      <w:lvlText w:val=""/>
+      <w:lvlJc w:val="left"/>
+      <w:pPr>
+        <w:tabs>
+          <w:tab w:val="num" w:pos="2160"/>
+        </w:tabs>
+        <w:ind w:left="2160" w:hanging="360"/>
+      </w:pPr>
+      <w:rPr>
+        <w:rFonts w:ascii="Wingdings" w:hAnsi="Wingdings" w:hint="default"/>
+        <w:sz w:val="20"/>
+      </w:rPr>
+    </w:lvl>
+    <w:lvl w:ilvl="3" w:tentative="1">
+      <w:start w:val="1"/>
+      <w:numFmt w:val="bullet"/>
+      <w:lvlText w:val=""/>
+      <w:lvlJc w:val="left"/>
+      <w:pPr>
+        <w:tabs>
+          <w:tab w:val="num" w:pos="2880"/>
+        </w:tabs>
+        <w:ind w:left="2880" w:hanging="360"/>
+      </w:pPr>
+      <w:rPr>
+        <w:rFonts w:ascii="Wingdings" w:hAnsi="Wingdings" w:hint="default"/>
+        <w:sz w:val="20"/>
+      </w:rPr>
+    </w:lvl>
+    <w:lvl w:ilvl="4" w:tentative="1">
+      <w:start w:val="1"/>
+      <w:numFmt w:val="bullet"/>
+      <w:lvlText w:val=""/>
+      <w:lvlJc w:val="left"/>
+      <w:pPr>
+        <w:tabs>
+          <w:tab w:val="num" w:pos="3600"/>
+        </w:tabs>
+        <w:ind w:left="3600" w:hanging="360"/>
+      </w:pPr>
+      <w:rPr>
+        <w:rFonts w:ascii="Wingdings" w:hAnsi="Wingdings" w:hint="default"/>
+        <w:sz w:val="20"/>
+      </w:rPr>
+    </w:lvl>
+    <w:lvl w:ilvl="5" w:tentative="1">
+      <w:start w:val="1"/>
+      <w:numFmt w:val="bullet"/>
+      <w:lvlText w:val=""/>
+      <w:lvlJc w:val="left"/>
+      <w:pPr>
+        <w:tabs>
+          <w:tab w:val="num" w:pos="4320"/>
+        </w:tabs>
+        <w:ind w:left="4320" w:hanging="360"/>
+      </w:pPr>
+      <w:rPr>
+        <w:rFonts w:ascii="Wingdings" w:hAnsi="Wingdings" w:hint="default"/>
+        <w:sz w:val="20"/>
+      </w:rPr>
+    </w:lvl>
+    <w:lvl w:ilvl="6" w:tentative="1">
+      <w:start w:val="1"/>
+      <w:numFmt w:val="bullet"/>
+      <w:lvlText w:val=""/>
+      <w:lvlJc w:val="left"/>
+      <w:pPr>
+        <w:tabs>
+          <w:tab w:val="num" w:pos="5040"/>
+        </w:tabs>
+        <w:ind w:left="5040" w:hanging="360"/>
+      </w:pPr>
+      <w:rPr>
+        <w:rFonts w:ascii="Wingdings" w:hAnsi="Wingdings" w:hint="default"/>
+        <w:sz w:val="20"/>
+      </w:rPr>
+    </w:lvl>
+    <w:lvl w:ilvl="7" w:tentative="1">
+      <w:start w:val="1"/>
+      <w:numFmt w:val="bullet"/>
+      <w:lvlText w:val=""/>
+      <w:lvlJc w:val="left"/>
+      <w:pPr>
+        <w:tabs>
+          <w:tab w:val="num" w:pos="5760"/>
+        </w:tabs>
+        <w:ind w:left="5760" w:hanging="360"/>
+      </w:pPr>
+      <w:rPr>
+        <w:rFonts w:ascii="Wingdings" w:hAnsi="Wingdings" w:hint="default"/>
+        <w:sz w:val="20"/>
+      </w:rPr>
+    </w:lvl>
+    <w:lvl w:ilvl="8" w:tentative="1">
+      <w:start w:val="1"/>
+      <w:numFmt w:val="bullet"/>
+      <w:lvlText w:val=""/>
+      <w:lvlJc w:val="left"/>
+      <w:pPr>
+        <w:tabs>
+          <w:tab w:val="num" w:pos="6480"/>
+        </w:tabs>
+        <w:ind w:left="6480" w:hanging="360"/>
+      </w:pPr>
+      <w:rPr>
+        <w:rFonts w:ascii="Wingdings" w:hAnsi="Wingdings" w:hint="default"/>
+        <w:sz w:val="20"/>
+      </w:rPr>
+    </w:lvl>
+  </w:abstractNum>
   <w:num w:numId="1" w16cid:durableId="1261648421">
+    <w:abstractNumId w:val="8"/>
+  </w:num>
+  <w:num w:numId="2" w16cid:durableId="1122187351">
+    <w:abstractNumId w:val="11"/>
+  </w:num>
+  <w:num w:numId="3" w16cid:durableId="1807310322">
     <w:abstractNumId w:val="0"/>
+  </w:num>
+  <w:num w:numId="4" w16cid:durableId="1513909552">
+    <w:abstractNumId w:val="3"/>
+  </w:num>
+  <w:num w:numId="5" w16cid:durableId="1778408666">
+    <w:abstractNumId w:val="2"/>
+  </w:num>
+  <w:num w:numId="6" w16cid:durableId="119347713">
+    <w:abstractNumId w:val="10"/>
+  </w:num>
+  <w:num w:numId="7" w16cid:durableId="234946751">
+    <w:abstractNumId w:val="9"/>
+  </w:num>
+  <w:num w:numId="8" w16cid:durableId="1934165471">
+    <w:abstractNumId w:val="5"/>
+  </w:num>
+  <w:num w:numId="9" w16cid:durableId="1459489086">
+    <w:abstractNumId w:val="7"/>
+  </w:num>
+  <w:num w:numId="10" w16cid:durableId="996344096">
+    <w:abstractNumId w:val="4"/>
+  </w:num>
+  <w:num w:numId="11" w16cid:durableId="2053309273">
+    <w:abstractNumId w:val="6"/>
+  </w:num>
+  <w:num w:numId="12" w16cid:durableId="2114785777">
+    <w:abstractNumId w:val="12"/>
+  </w:num>
+  <w:num w:numId="13" w16cid:durableId="1512523148">
+    <w:abstractNumId w:val="1"/>
   </w:num>
 </w:numbering>
 </file>

</xml_diff>